<commit_message>
Propuesta del puesto de corte sin usar el plano rev23 como fuente
Co-Authored-By: Claude Opus 5.5 <noreply@anthropic.com>
Claude-Session: https://claude.ai/code/session_01E33CYXtZ2f33D1RjoRdR65
</commit_message>
<xml_diff>
--- a/dimensiones/propuesta_puesto_corte.docx
+++ b/dimensiones/propuesta_puesto_corte.docx
@@ -14,7 +14,7 @@
           <w:sz w:val="30"/>
           <w:szCs w:val="30"/>
         </w:rPr>
-        <w:t xml:space="preserve">Puesto de corte (G1 + G2): qué falta o está mal dimensionado</w:t>
+        <w:t xml:space="preserve">Puesto de corte (G1 + G2): qué tiene que haber en el puesto</w:t>
       </w:r>
     </w:p>
     <w:p>
@@ -29,7 +29,7 @@
           <w:sz w:val="18"/>
           <w:szCs w:val="18"/>
         </w:rPr>
-        <w:t xml:space="preserve">Comparación entre el plano rev23, lo que pide el proceso y las fuentes. Es una propuesta para validar: todavía no se cargó en la planilla dimensiones_puestos. </w:t>
+        <w:t xml:space="preserve">Qué tiene que haber en el puesto según el proceso, con la fuente de cada medida. El plano rev23 no se usa como fuente. Es una propuesta para validar: todavía no se cargó en la planilla dimensiones_puestos. </w:t>
       </w:r>
       <w:r>
         <w:rPr>
@@ -945,7 +945,7 @@
           <w:sz w:val="18"/>
           <w:szCs w:val="18"/>
         </w:rPr>
-        <w:t xml:space="preserve">Recorrido: la chapa llega con el puente grúa; el operario la desliza con ventosas sobre los brazos de apoyo; la franja cae atrás, en la zona cerrada, y pasa a la mesa elevadora 2; la orilla queda adelante y va al carro de scrap; la G1 también corta las tiras y piezas de accesorios de carros.</w:t>
+        <w:t xml:space="preserve">Recorrido: la chapa llega con el puente grúa; el operario la desliza con ventosas sobre los brazos de apoyo; la franja cae atrás, en la zona cerrada, y pasa a la mesa elevadora 2; la orilla queda adelante y va al carro de scrap. La G1 también corta las tiras y piezas de accesorios de carros.</w:t>
       </w:r>
     </w:p>
     <w:tbl>
@@ -962,10 +962,10 @@
       </w:tblPr>
       <w:tblGrid>
         <w:gridCol w:w="2900"/>
-        <w:gridCol w:w="2600"/>
-        <w:gridCol w:w="4300"/>
-        <w:gridCol w:w="3438"/>
-        <w:gridCol w:w="1600"/>
+        <w:gridCol w:w="3300"/>
+        <w:gridCol w:w="4100"/>
+        <w:gridCol w:w="3038"/>
+        <w:gridCol w:w="1500"/>
       </w:tblGrid>
       <w:tr>
         <w:trPr>
@@ -1006,7 +1006,7 @@
         </w:tc>
         <w:tc>
           <w:tcPr>
-            <w:tcW w:type="dxa" w:w="2600"/>
+            <w:tcW w:type="dxa" w:w="3300"/>
             <w:tcBorders>
               <w:top w:val="single" w:color="A6A6A6" w:sz="4"/>
               <w:left w:val="single" w:color="A6A6A6" w:sz="4"/>
@@ -1033,13 +1033,13 @@
                 <w:sz w:val="18"/>
                 <w:szCs w:val="18"/>
               </w:rPr>
-              <w:t xml:space="preserve">En el plano rev23</w:t>
-            </w:r>
-          </w:p>
-        </w:tc>
-        <w:tc>
-          <w:tcPr>
-            <w:tcW w:type="dxa" w:w="4300"/>
+              <w:t xml:space="preserve">Qué pide el proceso</w:t>
+            </w:r>
+          </w:p>
+        </w:tc>
+        <w:tc>
+          <w:tcPr>
+            <w:tcW w:type="dxa" w:w="4100"/>
             <w:tcBorders>
               <w:top w:val="single" w:color="A6A6A6" w:sz="4"/>
               <w:left w:val="single" w:color="A6A6A6" w:sz="4"/>
@@ -1066,13 +1066,13 @@
                 <w:sz w:val="18"/>
                 <w:szCs w:val="18"/>
               </w:rPr>
-              <w:t xml:space="preserve">Propuesta</w:t>
-            </w:r>
-          </w:p>
-        </w:tc>
-        <w:tc>
-          <w:tcPr>
-            <w:tcW w:type="dxa" w:w="3438"/>
+              <w:t xml:space="preserve">Propuesta y medida</w:t>
+            </w:r>
+          </w:p>
+        </w:tc>
+        <w:tc>
+          <w:tcPr>
+            <w:tcW w:type="dxa" w:w="3038"/>
             <w:tcBorders>
               <w:top w:val="single" w:color="A6A6A6" w:sz="4"/>
               <w:left w:val="single" w:color="A6A6A6" w:sz="4"/>
@@ -1099,13 +1099,13 @@
                 <w:sz w:val="18"/>
                 <w:szCs w:val="18"/>
               </w:rPr>
-              <w:t xml:space="preserve">De dónde sale</w:t>
-            </w:r>
-          </w:p>
-        </w:tc>
-        <w:tc>
-          <w:tcPr>
-            <w:tcW w:type="dxa" w:w="1600"/>
+              <w:t xml:space="preserve">Fuente de la medida</w:t>
+            </w:r>
+          </w:p>
+        </w:tc>
+        <w:tc>
+          <w:tcPr>
+            <w:tcW w:type="dxa" w:w="1500"/>
             <w:tcBorders>
               <w:top w:val="single" w:color="A6A6A6" w:sz="4"/>
               <w:left w:val="single" w:color="A6A6A6" w:sz="4"/>
@@ -1170,37 +1170,37 @@
         </w:tc>
         <w:tc>
           <w:tcPr>
-            <w:tcW w:type="dxa" w:w="2600"/>
-            <w:tcBorders>
-              <w:top w:val="single" w:color="A6A6A6" w:sz="4"/>
-              <w:left w:val="single" w:color="A6A6A6" w:sz="4"/>
-              <w:bottom w:val="single" w:color="A6A6A6" w:sz="4"/>
-              <w:right w:val="single" w:color="A6A6A6" w:sz="4"/>
-            </w:tcBorders>
-            <w:tcMar>
-              <w:top w:type="dxa" w:w="40"/>
-              <w:left w:type="dxa" w:w="80"/>
-              <w:bottom w:type="dxa" w:w="40"/>
-              <w:right w:type="dxa" w:w="80"/>
-            </w:tcMar>
-          </w:tcPr>
-          <w:p>
-            <w:pPr>
-              <w:spacing w:after="0"/>
-            </w:pPr>
-            <w:r>
-              <w:rPr>
-                <w:rFonts w:ascii="Arial" w:cs="Arial" w:eastAsia="Arial" w:hAnsi="Arial"/>
-                <w:sz w:val="18"/>
-                <w:szCs w:val="18"/>
-              </w:rPr>
-              <w:t xml:space="preserve">3,4 × 1,9 m</w:t>
-            </w:r>
-          </w:p>
-        </w:tc>
-        <w:tc>
-          <w:tcPr>
-            <w:tcW w:type="dxa" w:w="4300"/>
+            <w:tcW w:type="dxa" w:w="3300"/>
+            <w:tcBorders>
+              <w:top w:val="single" w:color="A6A6A6" w:sz="4"/>
+              <w:left w:val="single" w:color="A6A6A6" w:sz="4"/>
+              <w:bottom w:val="single" w:color="A6A6A6" w:sz="4"/>
+              <w:right w:val="single" w:color="A6A6A6" w:sz="4"/>
+            </w:tcBorders>
+            <w:tcMar>
+              <w:top w:type="dxa" w:w="40"/>
+              <w:left w:type="dxa" w:w="80"/>
+              <w:bottom w:type="dxa" w:w="40"/>
+              <w:right w:type="dxa" w:w="80"/>
+            </w:tcMar>
+          </w:tcPr>
+          <w:p>
+            <w:pPr>
+              <w:spacing w:after="0"/>
+            </w:pPr>
+            <w:r>
+              <w:rPr>
+                <w:rFonts w:ascii="Arial" w:cs="Arial" w:eastAsia="Arial" w:hAnsi="Arial"/>
+                <w:sz w:val="18"/>
+                <w:szCs w:val="18"/>
+              </w:rPr>
+              <w:t xml:space="preserve">Corta la hoja en franjas</w:t>
+            </w:r>
+          </w:p>
+        </w:tc>
+        <w:tc>
+          <w:tcPr>
+            <w:tcW w:type="dxa" w:w="4100"/>
             <w:tcBorders>
               <w:top w:val="single" w:color="A6A6A6" w:sz="4"/>
               <w:left w:val="single" w:color="A6A6A6" w:sz="4"/>
@@ -1230,7 +1230,7 @@
         </w:tc>
         <w:tc>
           <w:tcPr>
-            <w:tcW w:type="dxa" w:w="3438"/>
+            <w:tcW w:type="dxa" w:w="3038"/>
             <w:tcBorders>
               <w:top w:val="single" w:color="A6A6A6" w:sz="4"/>
               <w:left w:val="single" w:color="A6A6A6" w:sz="4"/>
@@ -1260,7 +1260,7 @@
         </w:tc>
         <w:tc>
           <w:tcPr>
-            <w:tcW w:type="dxa" w:w="1600"/>
+            <w:tcW w:type="dxa" w:w="1500"/>
             <w:tcBorders>
               <w:top w:val="single" w:color="A6A6A6" w:sz="4"/>
               <w:left w:val="single" w:color="A6A6A6" w:sz="4"/>
@@ -1325,67 +1325,67 @@
         </w:tc>
         <w:tc>
           <w:tcPr>
-            <w:tcW w:type="dxa" w:w="2600"/>
-            <w:tcBorders>
-              <w:top w:val="single" w:color="A6A6A6" w:sz="4"/>
-              <w:left w:val="single" w:color="A6A6A6" w:sz="4"/>
-              <w:bottom w:val="single" w:color="A6A6A6" w:sz="4"/>
-              <w:right w:val="single" w:color="A6A6A6" w:sz="4"/>
-            </w:tcBorders>
-            <w:tcMar>
-              <w:top w:type="dxa" w:w="40"/>
-              <w:left w:type="dxa" w:w="80"/>
-              <w:bottom w:type="dxa" w:w="40"/>
-              <w:right w:type="dxa" w:w="80"/>
-            </w:tcMar>
-          </w:tcPr>
-          <w:p>
-            <w:pPr>
-              <w:spacing w:after="0"/>
-            </w:pPr>
-            <w:r>
-              <w:rPr>
-                <w:rFonts w:ascii="Arial" w:cs="Arial" w:eastAsia="Arial" w:hAnsi="Arial"/>
-                <w:sz w:val="18"/>
-                <w:szCs w:val="18"/>
-              </w:rPr>
-              <w:t xml:space="preserve">Mesa elevadora 1 + autoelevador</w:t>
-            </w:r>
-          </w:p>
-        </w:tc>
-        <w:tc>
-          <w:tcPr>
-            <w:tcW w:type="dxa" w:w="4300"/>
-            <w:tcBorders>
-              <w:top w:val="single" w:color="A6A6A6" w:sz="4"/>
-              <w:left w:val="single" w:color="A6A6A6" w:sz="4"/>
-              <w:bottom w:val="single" w:color="A6A6A6" w:sz="4"/>
-              <w:right w:val="single" w:color="A6A6A6" w:sz="4"/>
-            </w:tcBorders>
-            <w:tcMar>
-              <w:top w:type="dxa" w:w="40"/>
-              <w:left w:type="dxa" w:w="80"/>
-              <w:bottom w:type="dxa" w:w="40"/>
-              <w:right w:type="dxa" w:w="80"/>
-            </w:tcMar>
-          </w:tcPr>
-          <w:p>
-            <w:pPr>
-              <w:spacing w:after="0"/>
-            </w:pPr>
-            <w:r>
-              <w:rPr>
-                <w:rFonts w:ascii="Arial" w:cs="Arial" w:eastAsia="Arial" w:hAnsi="Arial"/>
-                <w:sz w:val="18"/>
-                <w:szCs w:val="18"/>
-              </w:rPr>
-              <w:t xml:space="preserve">Puente grúa (definido por el grupo). Falta decidir si la grúa deja el paquete en la mesa 1 o si la mesa sale</w:t>
-            </w:r>
-          </w:p>
-        </w:tc>
-        <w:tc>
-          <w:tcPr>
-            <w:tcW w:type="dxa" w:w="3438"/>
+            <w:tcW w:type="dxa" w:w="3300"/>
+            <w:tcBorders>
+              <w:top w:val="single" w:color="A6A6A6" w:sz="4"/>
+              <w:left w:val="single" w:color="A6A6A6" w:sz="4"/>
+              <w:bottom w:val="single" w:color="A6A6A6" w:sz="4"/>
+              <w:right w:val="single" w:color="A6A6A6" w:sz="4"/>
+            </w:tcBorders>
+            <w:tcMar>
+              <w:top w:type="dxa" w:w="40"/>
+              <w:left w:type="dxa" w:w="80"/>
+              <w:bottom w:type="dxa" w:w="40"/>
+              <w:right w:type="dxa" w:w="80"/>
+            </w:tcMar>
+          </w:tcPr>
+          <w:p>
+            <w:pPr>
+              <w:spacing w:after="0"/>
+            </w:pPr>
+            <w:r>
+              <w:rPr>
+                <w:rFonts w:ascii="Arial" w:cs="Arial" w:eastAsia="Arial" w:hAnsi="Arial"/>
+                <w:sz w:val="18"/>
+                <w:szCs w:val="18"/>
+              </w:rPr>
+              <w:t xml:space="preserve">Llevar la hoja a la altura de la mesa de la guillotina</w:t>
+            </w:r>
+          </w:p>
+        </w:tc>
+        <w:tc>
+          <w:tcPr>
+            <w:tcW w:type="dxa" w:w="4100"/>
+            <w:tcBorders>
+              <w:top w:val="single" w:color="A6A6A6" w:sz="4"/>
+              <w:left w:val="single" w:color="A6A6A6" w:sz="4"/>
+              <w:bottom w:val="single" w:color="A6A6A6" w:sz="4"/>
+              <w:right w:val="single" w:color="A6A6A6" w:sz="4"/>
+            </w:tcBorders>
+            <w:tcMar>
+              <w:top w:type="dxa" w:w="40"/>
+              <w:left w:type="dxa" w:w="80"/>
+              <w:bottom w:type="dxa" w:w="40"/>
+              <w:right w:type="dxa" w:w="80"/>
+            </w:tcMar>
+          </w:tcPr>
+          <w:p>
+            <w:pPr>
+              <w:spacing w:after="0"/>
+            </w:pPr>
+            <w:r>
+              <w:rPr>
+                <w:rFonts w:ascii="Arial" w:cs="Arial" w:eastAsia="Arial" w:hAnsi="Arial"/>
+                <w:sz w:val="18"/>
+                <w:szCs w:val="18"/>
+              </w:rPr>
+              <w:t xml:space="preserve">Puente grúa (definido por el grupo). Falta decidir si deja el paquete en una mesa elevadora o lleva la hoja directo a la G1</w:t>
+            </w:r>
+          </w:p>
+        </w:tc>
+        <w:tc>
+          <w:tcPr>
+            <w:tcW w:type="dxa" w:w="3038"/>
             <w:tcBorders>
               <w:top w:val="single" w:color="A6A6A6" w:sz="4"/>
               <w:left w:val="single" w:color="A6A6A6" w:sz="4"/>
@@ -1415,7 +1415,7 @@
         </w:tc>
         <w:tc>
           <w:tcPr>
-            <w:tcW w:type="dxa" w:w="1600"/>
+            <w:tcW w:type="dxa" w:w="1500"/>
             <w:tcBorders>
               <w:top w:val="single" w:color="A6A6A6" w:sz="4"/>
               <w:left w:val="single" w:color="A6A6A6" w:sz="4"/>
@@ -1480,67 +1480,67 @@
         </w:tc>
         <w:tc>
           <w:tcPr>
-            <w:tcW w:type="dxa" w:w="2600"/>
-            <w:tcBorders>
-              <w:top w:val="single" w:color="A6A6A6" w:sz="4"/>
-              <w:left w:val="single" w:color="A6A6A6" w:sz="4"/>
-              <w:bottom w:val="single" w:color="A6A6A6" w:sz="4"/>
-              <w:right w:val="single" w:color="A6A6A6" w:sz="4"/>
-            </w:tcBorders>
-            <w:tcMar>
-              <w:top w:type="dxa" w:w="40"/>
-              <w:left w:type="dxa" w:w="80"/>
-              <w:bottom w:type="dxa" w:w="40"/>
-              <w:right w:type="dxa" w:w="80"/>
-            </w:tcMar>
-          </w:tcPr>
-          <w:p>
-            <w:pPr>
-              <w:spacing w:after="0"/>
-            </w:pPr>
-            <w:r>
-              <w:rPr>
-                <w:rFonts w:ascii="Arial" w:cs="Arial" w:eastAsia="Arial" w:hAnsi="Arial"/>
-                <w:sz w:val="18"/>
-                <w:szCs w:val="18"/>
-              </w:rPr>
-              <w:t xml:space="preserve">1,8 × 1,0 m «con rodillos»</w:t>
-            </w:r>
-          </w:p>
-        </w:tc>
-        <w:tc>
-          <w:tcPr>
-            <w:tcW w:type="dxa" w:w="4300"/>
-            <w:tcBorders>
-              <w:top w:val="single" w:color="A6A6A6" w:sz="4"/>
-              <w:left w:val="single" w:color="A6A6A6" w:sz="4"/>
-              <w:bottom w:val="single" w:color="A6A6A6" w:sz="4"/>
-              <w:right w:val="single" w:color="A6A6A6" w:sz="4"/>
-            </w:tcBorders>
-            <w:tcMar>
-              <w:top w:type="dxa" w:w="40"/>
-              <w:left w:type="dxa" w:w="80"/>
-              <w:bottom w:type="dxa" w:w="40"/>
-              <w:right w:type="dxa" w:w="80"/>
-            </w:tcMar>
-          </w:tcPr>
-          <w:p>
-            <w:pPr>
-              <w:spacing w:after="0"/>
-            </w:pPr>
-            <w:r>
-              <w:rPr>
-                <w:rFonts w:ascii="Arial" w:cs="Arial" w:eastAsia="Arial" w:hAnsi="Arial"/>
-                <w:sz w:val="18"/>
-                <w:szCs w:val="18"/>
-              </w:rPr>
-              <w:t xml:space="preserve">Son de serie en la HGS; pedir su medida a Ermaksan. Los rodillos no están confirmados</w:t>
-            </w:r>
-          </w:p>
-        </w:tc>
-        <w:tc>
-          <w:tcPr>
-            <w:tcW w:type="dxa" w:w="3438"/>
+            <w:tcW w:type="dxa" w:w="3300"/>
+            <w:tcBorders>
+              <w:top w:val="single" w:color="A6A6A6" w:sz="4"/>
+              <w:left w:val="single" w:color="A6A6A6" w:sz="4"/>
+              <w:bottom w:val="single" w:color="A6A6A6" w:sz="4"/>
+              <w:right w:val="single" w:color="A6A6A6" w:sz="4"/>
+            </w:tcBorders>
+            <w:tcMar>
+              <w:top w:type="dxa" w:w="40"/>
+              <w:left w:type="dxa" w:w="80"/>
+              <w:bottom w:type="dxa" w:w="40"/>
+              <w:right w:type="dxa" w:w="80"/>
+            </w:tcMar>
+          </w:tcPr>
+          <w:p>
+            <w:pPr>
+              <w:spacing w:after="0"/>
+            </w:pPr>
+            <w:r>
+              <w:rPr>
+                <w:rFonts w:ascii="Arial" w:cs="Arial" w:eastAsia="Arial" w:hAnsi="Arial"/>
+                <w:sz w:val="18"/>
+                <w:szCs w:val="18"/>
+              </w:rPr>
+              <w:t xml:space="preserve">Apoyar y escuadrar la hoja antes del corte</w:t>
+            </w:r>
+          </w:p>
+        </w:tc>
+        <w:tc>
+          <w:tcPr>
+            <w:tcW w:type="dxa" w:w="4100"/>
+            <w:tcBorders>
+              <w:top w:val="single" w:color="A6A6A6" w:sz="4"/>
+              <w:left w:val="single" w:color="A6A6A6" w:sz="4"/>
+              <w:bottom w:val="single" w:color="A6A6A6" w:sz="4"/>
+              <w:right w:val="single" w:color="A6A6A6" w:sz="4"/>
+            </w:tcBorders>
+            <w:tcMar>
+              <w:top w:type="dxa" w:w="40"/>
+              <w:left w:type="dxa" w:w="80"/>
+              <w:bottom w:type="dxa" w:w="40"/>
+              <w:right w:type="dxa" w:w="80"/>
+            </w:tcMar>
+          </w:tcPr>
+          <w:p>
+            <w:pPr>
+              <w:spacing w:after="0"/>
+            </w:pPr>
+            <w:r>
+              <w:rPr>
+                <w:rFonts w:ascii="Arial" w:cs="Arial" w:eastAsia="Arial" w:hAnsi="Arial"/>
+                <w:sz w:val="18"/>
+                <w:szCs w:val="18"/>
+              </w:rPr>
+              <w:t xml:space="preserve">Son de serie en la HGS (con escuadra lateral de 1.000 mm). Falta su medida</w:t>
+            </w:r>
+          </w:p>
+        </w:tc>
+        <w:tc>
+          <w:tcPr>
+            <w:tcW w:type="dxa" w:w="3038"/>
             <w:tcBorders>
               <w:top w:val="single" w:color="A6A6A6" w:sz="4"/>
               <w:left w:val="single" w:color="A6A6A6" w:sz="4"/>
@@ -1570,7 +1570,7 @@
         </w:tc>
         <w:tc>
           <w:tcPr>
-            <w:tcW w:type="dxa" w:w="1600"/>
+            <w:tcW w:type="dxa" w:w="1500"/>
             <w:tcBorders>
               <w:top w:val="single" w:color="A6A6A6" w:sz="4"/>
               <w:left w:val="single" w:color="A6A6A6" w:sz="4"/>
@@ -1629,103 +1629,103 @@
                 <w:sz w:val="18"/>
                 <w:szCs w:val="18"/>
               </w:rPr>
-              <w:t xml:space="preserve">Zona del tope trasero (franjas)</w:t>
-            </w:r>
-          </w:p>
-        </w:tc>
-        <w:tc>
-          <w:tcPr>
-            <w:tcW w:type="dxa" w:w="2600"/>
-            <w:tcBorders>
-              <w:top w:val="single" w:color="A6A6A6" w:sz="4"/>
-              <w:left w:val="single" w:color="A6A6A6" w:sz="4"/>
-              <w:bottom w:val="single" w:color="A6A6A6" w:sz="4"/>
-              <w:right w:val="single" w:color="A6A6A6" w:sz="4"/>
-            </w:tcBorders>
-            <w:tcMar>
-              <w:top w:type="dxa" w:w="40"/>
-              <w:left w:type="dxa" w:w="80"/>
-              <w:bottom w:type="dxa" w:w="40"/>
-              <w:right w:type="dxa" w:w="80"/>
-            </w:tcMar>
-          </w:tcPr>
-          <w:p>
-            <w:pPr>
-              <w:spacing w:after="0"/>
-            </w:pPr>
-            <w:r>
-              <w:rPr>
-                <w:rFonts w:ascii="Arial" w:cs="Arial" w:eastAsia="Arial" w:hAnsi="Arial"/>
-                <w:sz w:val="18"/>
-                <w:szCs w:val="18"/>
-              </w:rPr>
-              <w:t xml:space="preserve">3,4 × 1,0 m</w:t>
-            </w:r>
-          </w:p>
-        </w:tc>
-        <w:tc>
-          <w:tcPr>
-            <w:tcW w:type="dxa" w:w="4300"/>
-            <w:tcBorders>
-              <w:top w:val="single" w:color="A6A6A6" w:sz="4"/>
-              <w:left w:val="single" w:color="A6A6A6" w:sz="4"/>
-              <w:bottom w:val="single" w:color="A6A6A6" w:sz="4"/>
-              <w:right w:val="single" w:color="A6A6A6" w:sz="4"/>
-            </w:tcBorders>
-            <w:tcMar>
-              <w:top w:type="dxa" w:w="40"/>
-              <w:left w:type="dxa" w:w="80"/>
-              <w:bottom w:type="dxa" w:w="40"/>
-              <w:right w:type="dxa" w:w="80"/>
-            </w:tcMar>
-          </w:tcPr>
-          <w:p>
-            <w:pPr>
-              <w:spacing w:after="0"/>
-            </w:pPr>
-            <w:r>
-              <w:rPr>
-                <w:rFonts w:ascii="Arial" w:cs="Arial" w:eastAsia="Arial" w:hAnsi="Arial"/>
-                <w:sz w:val="18"/>
-                <w:szCs w:val="18"/>
-              </w:rPr>
-              <w:t xml:space="preserve">Zona cerrada por la cortina de luz y demarcada en el piso. Nadie entra mientras corta</w:t>
-            </w:r>
-          </w:p>
-        </w:tc>
-        <w:tc>
-          <w:tcPr>
-            <w:tcW w:type="dxa" w:w="3438"/>
-            <w:tcBorders>
-              <w:top w:val="single" w:color="A6A6A6" w:sz="4"/>
-              <w:left w:val="single" w:color="A6A6A6" w:sz="4"/>
-              <w:bottom w:val="single" w:color="A6A6A6" w:sz="4"/>
-              <w:right w:val="single" w:color="A6A6A6" w:sz="4"/>
-            </w:tcBorders>
-            <w:tcMar>
-              <w:top w:type="dxa" w:w="40"/>
-              <w:left w:type="dxa" w:w="80"/>
-              <w:bottom w:type="dxa" w:w="40"/>
-              <w:right w:type="dxa" w:w="80"/>
-            </w:tcMar>
-          </w:tcPr>
-          <w:p>
-            <w:pPr>
-              <w:spacing w:after="0"/>
-            </w:pPr>
-            <w:r>
-              <w:rPr>
-                <w:rFonts w:ascii="Arial" w:cs="Arial" w:eastAsia="Arial" w:hAnsi="Arial"/>
-                <w:sz w:val="18"/>
-                <w:szCs w:val="18"/>
-              </w:rPr>
-              <w:t xml:space="preserve">Plano · Decreto 351/79 art. 103</w:t>
-            </w:r>
-          </w:p>
-        </w:tc>
-        <w:tc>
-          <w:tcPr>
-            <w:tcW w:type="dxa" w:w="1600"/>
+              <w:t xml:space="preserve">Zona detrás de la cuchilla (tope trasero)</w:t>
+            </w:r>
+          </w:p>
+        </w:tc>
+        <w:tc>
+          <w:tcPr>
+            <w:tcW w:type="dxa" w:w="3300"/>
+            <w:tcBorders>
+              <w:top w:val="single" w:color="A6A6A6" w:sz="4"/>
+              <w:left w:val="single" w:color="A6A6A6" w:sz="4"/>
+              <w:bottom w:val="single" w:color="A6A6A6" w:sz="4"/>
+              <w:right w:val="single" w:color="A6A6A6" w:sz="4"/>
+            </w:tcBorders>
+            <w:tcMar>
+              <w:top w:type="dxa" w:w="40"/>
+              <w:left w:type="dxa" w:w="80"/>
+              <w:bottom w:type="dxa" w:w="40"/>
+              <w:right w:type="dxa" w:w="80"/>
+            </w:tcMar>
+          </w:tcPr>
+          <w:p>
+            <w:pPr>
+              <w:spacing w:after="0"/>
+            </w:pPr>
+            <w:r>
+              <w:rPr>
+                <w:rFonts w:ascii="Arial" w:cs="Arial" w:eastAsia="Arial" w:hAnsi="Arial"/>
+                <w:sz w:val="18"/>
+                <w:szCs w:val="18"/>
+              </w:rPr>
+              <w:t xml:space="preserve">Ahí caen las franjas</w:t>
+            </w:r>
+          </w:p>
+        </w:tc>
+        <w:tc>
+          <w:tcPr>
+            <w:tcW w:type="dxa" w:w="4100"/>
+            <w:tcBorders>
+              <w:top w:val="single" w:color="A6A6A6" w:sz="4"/>
+              <w:left w:val="single" w:color="A6A6A6" w:sz="4"/>
+              <w:bottom w:val="single" w:color="A6A6A6" w:sz="4"/>
+              <w:right w:val="single" w:color="A6A6A6" w:sz="4"/>
+            </w:tcBorders>
+            <w:tcMar>
+              <w:top w:type="dxa" w:w="40"/>
+              <w:left w:type="dxa" w:w="80"/>
+              <w:bottom w:type="dxa" w:w="40"/>
+              <w:right w:type="dxa" w:w="80"/>
+            </w:tcMar>
+          </w:tcPr>
+          <w:p>
+            <w:pPr>
+              <w:spacing w:after="0"/>
+            </w:pPr>
+            <w:r>
+              <w:rPr>
+                <w:rFonts w:ascii="Arial" w:cs="Arial" w:eastAsia="Arial" w:hAnsi="Arial"/>
+                <w:sz w:val="18"/>
+                <w:szCs w:val="18"/>
+              </w:rPr>
+              <w:t xml:space="preserve">3,40 × 1,00 m: largo de la máquina × recorrido del tope de 1.000 mm. Cerrada y demarcada; nadie entra mientras corta</w:t>
+            </w:r>
+          </w:p>
+        </w:tc>
+        <w:tc>
+          <w:tcPr>
+            <w:tcW w:type="dxa" w:w="3038"/>
+            <w:tcBorders>
+              <w:top w:val="single" w:color="A6A6A6" w:sz="4"/>
+              <w:left w:val="single" w:color="A6A6A6" w:sz="4"/>
+              <w:bottom w:val="single" w:color="A6A6A6" w:sz="4"/>
+              <w:right w:val="single" w:color="A6A6A6" w:sz="4"/>
+            </w:tcBorders>
+            <w:tcMar>
+              <w:top w:type="dxa" w:w="40"/>
+              <w:left w:type="dxa" w:w="80"/>
+              <w:bottom w:type="dxa" w:w="40"/>
+              <w:right w:type="dxa" w:w="80"/>
+            </w:tcMar>
+          </w:tcPr>
+          <w:p>
+            <w:pPr>
+              <w:spacing w:after="0"/>
+            </w:pPr>
+            <w:r>
+              <w:rPr>
+                <w:rFonts w:ascii="Arial" w:cs="Arial" w:eastAsia="Arial" w:hAnsi="Arial"/>
+                <w:sz w:val="18"/>
+                <w:szCs w:val="18"/>
+              </w:rPr>
+              <w:t xml:space="preserve">Ficha HGS: tope motorizado de 1.000 mm</w:t>
+            </w:r>
+          </w:p>
+        </w:tc>
+        <w:tc>
+          <w:tcPr>
+            <w:tcW w:type="dxa" w:w="1500"/>
             <w:tcBorders>
               <w:top w:val="single" w:color="A6A6A6" w:sz="4"/>
               <w:left w:val="single" w:color="A6A6A6" w:sz="4"/>
@@ -1790,97 +1790,97 @@
         </w:tc>
         <w:tc>
           <w:tcPr>
-            <w:tcW w:type="dxa" w:w="2600"/>
-            <w:tcBorders>
-              <w:top w:val="single" w:color="A6A6A6" w:sz="4"/>
-              <w:left w:val="single" w:color="A6A6A6" w:sz="4"/>
-              <w:bottom w:val="single" w:color="A6A6A6" w:sz="4"/>
-              <w:right w:val="single" w:color="A6A6A6" w:sz="4"/>
-            </w:tcBorders>
-            <w:tcMar>
-              <w:top w:type="dxa" w:w="40"/>
-              <w:left w:type="dxa" w:w="80"/>
-              <w:bottom w:type="dxa" w:w="40"/>
-              <w:right w:type="dxa" w:w="80"/>
-            </w:tcMar>
-          </w:tcPr>
-          <w:p>
-            <w:pPr>
-              <w:spacing w:after="0"/>
-            </w:pPr>
-            <w:r>
-              <w:rPr>
-                <w:rFonts w:ascii="Arial" w:cs="Arial" w:eastAsia="Arial" w:hAnsi="Arial"/>
-                <w:sz w:val="18"/>
-                <w:szCs w:val="18"/>
-              </w:rPr>
-              <w:t xml:space="preserve">No figuran</w:t>
-            </w:r>
-          </w:p>
-        </w:tc>
-        <w:tc>
-          <w:tcPr>
-            <w:tcW w:type="dxa" w:w="4300"/>
-            <w:tcBorders>
-              <w:top w:val="single" w:color="A6A6A6" w:sz="4"/>
-              <w:left w:val="single" w:color="A6A6A6" w:sz="4"/>
-              <w:bottom w:val="single" w:color="A6A6A6" w:sz="4"/>
-              <w:right w:val="single" w:color="A6A6A6" w:sz="4"/>
-            </w:tcBorders>
-            <w:tcMar>
-              <w:top w:type="dxa" w:w="40"/>
-              <w:left w:type="dxa" w:w="80"/>
-              <w:bottom w:type="dxa" w:w="40"/>
-              <w:right w:type="dxa" w:w="80"/>
-            </w:tcMar>
-          </w:tcPr>
-          <w:p>
-            <w:pPr>
-              <w:spacing w:after="0"/>
-            </w:pPr>
-            <w:r>
-              <w:rPr>
-                <w:rFonts w:ascii="Arial" w:cs="Arial" w:eastAsia="Arial" w:hAnsi="Arial"/>
-                <w:sz w:val="18"/>
-                <w:szCs w:val="18"/>
-              </w:rPr>
-              <w:t xml:space="preserve">Pedirlos en la compra (kit CE). Un solo pedal: el 2.º operario solo ayuda con las ventosas</w:t>
-            </w:r>
-          </w:p>
-        </w:tc>
-        <w:tc>
-          <w:tcPr>
-            <w:tcW w:type="dxa" w:w="3438"/>
-            <w:tcBorders>
-              <w:top w:val="single" w:color="A6A6A6" w:sz="4"/>
-              <w:left w:val="single" w:color="A6A6A6" w:sz="4"/>
-              <w:bottom w:val="single" w:color="A6A6A6" w:sz="4"/>
-              <w:right w:val="single" w:color="A6A6A6" w:sz="4"/>
-            </w:tcBorders>
-            <w:tcMar>
-              <w:top w:type="dxa" w:w="40"/>
-              <w:left w:type="dxa" w:w="80"/>
-              <w:bottom w:type="dxa" w:w="40"/>
-              <w:right w:type="dxa" w:w="80"/>
-            </w:tcMar>
-          </w:tcPr>
-          <w:p>
-            <w:pPr>
-              <w:spacing w:after="0"/>
-            </w:pPr>
-            <w:r>
-              <w:rPr>
-                <w:rFonts w:ascii="Arial" w:cs="Arial" w:eastAsia="Arial" w:hAnsi="Arial"/>
-                <w:sz w:val="18"/>
-                <w:szCs w:val="18"/>
-              </w:rPr>
-              <w:t xml:space="preserve">Aviso Exapro HGS 2600-6 · Word Manuales › Seguridad</w:t>
-            </w:r>
-          </w:p>
-        </w:tc>
-        <w:tc>
-          <w:tcPr>
-            <w:tcW w:type="dxa" w:w="1600"/>
+            <w:tcW w:type="dxa" w:w="3300"/>
+            <w:tcBorders>
+              <w:top w:val="single" w:color="A6A6A6" w:sz="4"/>
+              <w:left w:val="single" w:color="A6A6A6" w:sz="4"/>
+              <w:bottom w:val="single" w:color="A6A6A6" w:sz="4"/>
+              <w:right w:val="single" w:color="A6A6A6" w:sz="4"/>
+            </w:tcBorders>
+            <w:tcMar>
+              <w:top w:type="dxa" w:w="40"/>
+              <w:left w:type="dxa" w:w="80"/>
+              <w:bottom w:type="dxa" w:w="40"/>
+              <w:right w:type="dxa" w:w="80"/>
+            </w:tcMar>
+          </w:tcPr>
+          <w:p>
+            <w:pPr>
+              <w:spacing w:after="0"/>
+            </w:pPr>
+            <w:r>
+              <w:rPr>
+                <w:rFonts w:ascii="Arial" w:cs="Arial" w:eastAsia="Arial" w:hAnsi="Arial"/>
+                <w:sz w:val="18"/>
+                <w:szCs w:val="18"/>
+              </w:rPr>
+              <w:t xml:space="preserve">Barreras traseras, protección de garganta y una sola persona en el pedal</w:t>
+            </w:r>
+          </w:p>
+        </w:tc>
+        <w:tc>
+          <w:tcPr>
+            <w:tcW w:type="dxa" w:w="4100"/>
+            <w:tcBorders>
+              <w:top w:val="single" w:color="A6A6A6" w:sz="4"/>
+              <w:left w:val="single" w:color="A6A6A6" w:sz="4"/>
+              <w:bottom w:val="single" w:color="A6A6A6" w:sz="4"/>
+              <w:right w:val="single" w:color="A6A6A6" w:sz="4"/>
+            </w:tcBorders>
+            <w:tcMar>
+              <w:top w:type="dxa" w:w="40"/>
+              <w:left w:type="dxa" w:w="80"/>
+              <w:bottom w:type="dxa" w:w="40"/>
+              <w:right w:type="dxa" w:w="80"/>
+            </w:tcMar>
+          </w:tcPr>
+          <w:p>
+            <w:pPr>
+              <w:spacing w:after="0"/>
+            </w:pPr>
+            <w:r>
+              <w:rPr>
+                <w:rFonts w:ascii="Arial" w:cs="Arial" w:eastAsia="Arial" w:hAnsi="Arial"/>
+                <w:sz w:val="18"/>
+                <w:szCs w:val="18"/>
+              </w:rPr>
+              <w:t xml:space="preserve">Pedirlos en la compra (kit CE). El 2.º operario solo ayuda con las ventosas</w:t>
+            </w:r>
+          </w:p>
+        </w:tc>
+        <w:tc>
+          <w:tcPr>
+            <w:tcW w:type="dxa" w:w="3038"/>
+            <w:tcBorders>
+              <w:top w:val="single" w:color="A6A6A6" w:sz="4"/>
+              <w:left w:val="single" w:color="A6A6A6" w:sz="4"/>
+              <w:bottom w:val="single" w:color="A6A6A6" w:sz="4"/>
+              <w:right w:val="single" w:color="A6A6A6" w:sz="4"/>
+            </w:tcBorders>
+            <w:tcMar>
+              <w:top w:type="dxa" w:w="40"/>
+              <w:left w:type="dxa" w:w="80"/>
+              <w:bottom w:type="dxa" w:w="40"/>
+              <w:right w:type="dxa" w:w="80"/>
+            </w:tcMar>
+          </w:tcPr>
+          <w:p>
+            <w:pPr>
+              <w:spacing w:after="0"/>
+            </w:pPr>
+            <w:r>
+              <w:rPr>
+                <w:rFonts w:ascii="Arial" w:cs="Arial" w:eastAsia="Arial" w:hAnsi="Arial"/>
+                <w:sz w:val="18"/>
+                <w:szCs w:val="18"/>
+              </w:rPr>
+              <w:t xml:space="preserve">Aviso Exapro HGS 2600-6 · Decreto 351/79 art. 103</w:t>
+            </w:r>
+          </w:p>
+        </w:tc>
+        <w:tc>
+          <w:tcPr>
+            <w:tcW w:type="dxa" w:w="1500"/>
             <w:tcBorders>
               <w:top w:val="single" w:color="A6A6A6" w:sz="4"/>
               <w:left w:val="single" w:color="A6A6A6" w:sz="4"/>
@@ -1945,97 +1945,252 @@
         </w:tc>
         <w:tc>
           <w:tcPr>
-            <w:tcW w:type="dxa" w:w="2600"/>
-            <w:tcBorders>
-              <w:top w:val="single" w:color="A6A6A6" w:sz="4"/>
-              <w:left w:val="single" w:color="A6A6A6" w:sz="4"/>
-              <w:bottom w:val="single" w:color="A6A6A6" w:sz="4"/>
-              <w:right w:val="single" w:color="A6A6A6" w:sz="4"/>
-            </w:tcBorders>
-            <w:tcMar>
-              <w:top w:type="dxa" w:w="40"/>
-              <w:left w:type="dxa" w:w="80"/>
-              <w:bottom w:type="dxa" w:w="40"/>
-              <w:right w:type="dxa" w:w="80"/>
-            </w:tcMar>
-          </w:tcPr>
-          <w:p>
-            <w:pPr>
-              <w:spacing w:after="0"/>
-            </w:pPr>
-            <w:r>
-              <w:rPr>
-                <w:rFonts w:ascii="Arial" w:cs="Arial" w:eastAsia="Arial" w:hAnsi="Arial"/>
-                <w:sz w:val="18"/>
-                <w:szCs w:val="18"/>
-              </w:rPr>
-              <w:t xml:space="preserve">No hay: el único está en la G2, a unos 5 m</w:t>
-            </w:r>
-          </w:p>
-        </w:tc>
-        <w:tc>
-          <w:tcPr>
-            <w:tcW w:type="dxa" w:w="4300"/>
-            <w:tcBorders>
-              <w:top w:val="single" w:color="A6A6A6" w:sz="4"/>
-              <w:left w:val="single" w:color="A6A6A6" w:sz="4"/>
-              <w:bottom w:val="single" w:color="A6A6A6" w:sz="4"/>
-              <w:right w:val="single" w:color="A6A6A6" w:sz="4"/>
-            </w:tcBorders>
-            <w:tcMar>
-              <w:top w:type="dxa" w:w="40"/>
-              <w:left w:type="dxa" w:w="80"/>
-              <w:bottom w:type="dxa" w:w="40"/>
-              <w:right w:type="dxa" w:w="80"/>
-            </w:tcMar>
-          </w:tcPr>
-          <w:p>
-            <w:pPr>
-              <w:spacing w:after="0"/>
-            </w:pPr>
-            <w:r>
-              <w:rPr>
-                <w:rFonts w:ascii="Arial" w:cs="Arial" w:eastAsia="Arial" w:hAnsi="Arial"/>
-                <w:sz w:val="18"/>
-                <w:szCs w:val="18"/>
-              </w:rPr>
-              <w:t xml:space="preserve">Carro 0,7 × 1,09 m al costado de la G1, del lado del operario (ahí queda la orilla)</w:t>
-            </w:r>
-          </w:p>
-        </w:tc>
-        <w:tc>
-          <w:tcPr>
-            <w:tcW w:type="dxa" w:w="3438"/>
-            <w:tcBorders>
-              <w:top w:val="single" w:color="A6A6A6" w:sz="4"/>
-              <w:left w:val="single" w:color="A6A6A6" w:sz="4"/>
-              <w:bottom w:val="single" w:color="A6A6A6" w:sz="4"/>
-              <w:right w:val="single" w:color="A6A6A6" w:sz="4"/>
-            </w:tcBorders>
-            <w:tcMar>
-              <w:top w:type="dxa" w:w="40"/>
-              <w:left w:type="dxa" w:w="80"/>
-              <w:bottom w:type="dxa" w:w="40"/>
-              <w:right w:type="dxa" w:w="80"/>
-            </w:tcMar>
-          </w:tcPr>
-          <w:p>
-            <w:pPr>
-              <w:spacing w:after="0"/>
-            </w:pPr>
-            <w:r>
-              <w:rPr>
-                <w:rFonts w:ascii="Arial" w:cs="Arial" w:eastAsia="Arial" w:hAnsi="Arial"/>
-                <w:sz w:val="18"/>
-                <w:szCs w:val="18"/>
-              </w:rPr>
-              <w:t xml:space="preserve">Opción B acordada en el chat</w:t>
-            </w:r>
-          </w:p>
-        </w:tc>
-        <w:tc>
-          <w:tcPr>
-            <w:tcW w:type="dxa" w:w="1600"/>
+            <w:tcW w:type="dxa" w:w="3300"/>
+            <w:tcBorders>
+              <w:top w:val="single" w:color="A6A6A6" w:sz="4"/>
+              <w:left w:val="single" w:color="A6A6A6" w:sz="4"/>
+              <w:bottom w:val="single" w:color="A6A6A6" w:sz="4"/>
+              <w:right w:val="single" w:color="A6A6A6" w:sz="4"/>
+            </w:tcBorders>
+            <w:tcMar>
+              <w:top w:type="dxa" w:w="40"/>
+              <w:left w:type="dxa" w:w="80"/>
+              <w:bottom w:type="dxa" w:w="40"/>
+              <w:right w:type="dxa" w:w="80"/>
+            </w:tcMar>
+          </w:tcPr>
+          <w:p>
+            <w:pPr>
+              <w:spacing w:after="0"/>
+            </w:pPr>
+            <w:r>
+              <w:rPr>
+                <w:rFonts w:ascii="Arial" w:cs="Arial" w:eastAsia="Arial" w:hAnsi="Arial"/>
+                <w:sz w:val="18"/>
+                <w:szCs w:val="18"/>
+              </w:rPr>
+              <w:t xml:space="preserve">La orilla de la hoja queda adelante, del lado del operario</w:t>
+            </w:r>
+          </w:p>
+        </w:tc>
+        <w:tc>
+          <w:tcPr>
+            <w:tcW w:type="dxa" w:w="4100"/>
+            <w:tcBorders>
+              <w:top w:val="single" w:color="A6A6A6" w:sz="4"/>
+              <w:left w:val="single" w:color="A6A6A6" w:sz="4"/>
+              <w:bottom w:val="single" w:color="A6A6A6" w:sz="4"/>
+              <w:right w:val="single" w:color="A6A6A6" w:sz="4"/>
+            </w:tcBorders>
+            <w:tcMar>
+              <w:top w:type="dxa" w:w="40"/>
+              <w:left w:type="dxa" w:w="80"/>
+              <w:bottom w:type="dxa" w:w="40"/>
+              <w:right w:type="dxa" w:w="80"/>
+            </w:tcMar>
+          </w:tcPr>
+          <w:p>
+            <w:pPr>
+              <w:spacing w:after="0"/>
+            </w:pPr>
+            <w:r>
+              <w:rPr>
+                <w:rFonts w:ascii="Arial" w:cs="Arial" w:eastAsia="Arial" w:hAnsi="Arial"/>
+                <w:sz w:val="18"/>
+                <w:szCs w:val="18"/>
+              </w:rPr>
+              <w:t xml:space="preserve">Carro al costado de la G1, del lado del operario</w:t>
+            </w:r>
+          </w:p>
+        </w:tc>
+        <w:tc>
+          <w:tcPr>
+            <w:tcW w:type="dxa" w:w="3038"/>
+            <w:tcBorders>
+              <w:top w:val="single" w:color="A6A6A6" w:sz="4"/>
+              <w:left w:val="single" w:color="A6A6A6" w:sz="4"/>
+              <w:bottom w:val="single" w:color="A6A6A6" w:sz="4"/>
+              <w:right w:val="single" w:color="A6A6A6" w:sz="4"/>
+            </w:tcBorders>
+            <w:tcMar>
+              <w:top w:type="dxa" w:w="40"/>
+              <w:left w:type="dxa" w:w="80"/>
+              <w:bottom w:type="dxa" w:w="40"/>
+              <w:right w:type="dxa" w:w="80"/>
+            </w:tcMar>
+          </w:tcPr>
+          <w:p>
+            <w:pPr>
+              <w:spacing w:after="0"/>
+            </w:pPr>
+            <w:r>
+              <w:rPr>
+                <w:rFonts w:ascii="Arial" w:cs="Arial" w:eastAsia="Arial" w:hAnsi="Arial"/>
+                <w:sz w:val="18"/>
+                <w:szCs w:val="18"/>
+              </w:rPr>
+              <w:t xml:space="preserve">Medida sin fuente</w:t>
+            </w:r>
+          </w:p>
+        </w:tc>
+        <w:tc>
+          <w:tcPr>
+            <w:tcW w:type="dxa" w:w="1500"/>
+            <w:tcBorders>
+              <w:top w:val="single" w:color="A6A6A6" w:sz="4"/>
+              <w:left w:val="single" w:color="A6A6A6" w:sz="4"/>
+              <w:bottom w:val="single" w:color="A6A6A6" w:sz="4"/>
+              <w:right w:val="single" w:color="A6A6A6" w:sz="4"/>
+            </w:tcBorders>
+            <w:tcMar>
+              <w:top w:type="dxa" w:w="40"/>
+              <w:left w:type="dxa" w:w="80"/>
+              <w:bottom w:type="dxa" w:w="40"/>
+              <w:right w:type="dxa" w:w="80"/>
+            </w:tcMar>
+          </w:tcPr>
+          <w:p>
+            <w:pPr>
+              <w:spacing w:after="0"/>
+            </w:pPr>
+            <w:r>
+              <w:rPr>
+                <w:rFonts w:ascii="Arial" w:cs="Arial" w:eastAsia="Arial" w:hAnsi="Arial"/>
+                <w:b/>
+                <w:bCs/>
+                <w:color w:val="7F6000"/>
+                <w:sz w:val="18"/>
+                <w:szCs w:val="18"/>
+              </w:rPr>
+              <w:t xml:space="preserve">A confirmar</w:t>
+            </w:r>
+          </w:p>
+        </w:tc>
+      </w:tr>
+      <w:tr>
+        <w:tc>
+          <w:tcPr>
+            <w:tcW w:type="dxa" w:w="2900"/>
+            <w:tcBorders>
+              <w:top w:val="single" w:color="A6A6A6" w:sz="4"/>
+              <w:left w:val="single" w:color="A6A6A6" w:sz="4"/>
+              <w:bottom w:val="single" w:color="A6A6A6" w:sz="4"/>
+              <w:right w:val="single" w:color="A6A6A6" w:sz="4"/>
+            </w:tcBorders>
+            <w:tcMar>
+              <w:top w:type="dxa" w:w="40"/>
+              <w:left w:type="dxa" w:w="80"/>
+              <w:bottom w:type="dxa" w:w="40"/>
+              <w:right w:type="dxa" w:w="80"/>
+            </w:tcMar>
+          </w:tcPr>
+          <w:p>
+            <w:pPr>
+              <w:spacing w:after="0"/>
+            </w:pPr>
+            <w:r>
+              <w:rPr>
+                <w:rFonts w:ascii="Arial" w:cs="Arial" w:eastAsia="Arial" w:hAnsi="Arial"/>
+                <w:sz w:val="18"/>
+                <w:szCs w:val="18"/>
+              </w:rPr>
+              <w:t xml:space="preserve">Carro de cajas: piezas de accesorios de carros (pulmón hacia el 8.1)</w:t>
+            </w:r>
+          </w:p>
+        </w:tc>
+        <w:tc>
+          <w:tcPr>
+            <w:tcW w:type="dxa" w:w="3300"/>
+            <w:tcBorders>
+              <w:top w:val="single" w:color="A6A6A6" w:sz="4"/>
+              <w:left w:val="single" w:color="A6A6A6" w:sz="4"/>
+              <w:bottom w:val="single" w:color="A6A6A6" w:sz="4"/>
+              <w:right w:val="single" w:color="A6A6A6" w:sz="4"/>
+            </w:tcBorders>
+            <w:tcMar>
+              <w:top w:type="dxa" w:w="40"/>
+              <w:left w:type="dxa" w:w="80"/>
+              <w:bottom w:type="dxa" w:w="40"/>
+              <w:right w:type="dxa" w:w="80"/>
+            </w:tcMar>
+          </w:tcPr>
+          <w:p>
+            <w:pPr>
+              <w:spacing w:after="0"/>
+            </w:pPr>
+            <w:r>
+              <w:rPr>
+                <w:rFonts w:ascii="Arial" w:cs="Arial" w:eastAsia="Arial" w:hAnsi="Arial"/>
+                <w:sz w:val="18"/>
+                <w:szCs w:val="18"/>
+              </w:rPr>
+              <w:t xml:space="preserve">La G1 corta las tiras y piezas de accesorios; el 8.1 las busca una vez por día</w:t>
+            </w:r>
+          </w:p>
+        </w:tc>
+        <w:tc>
+          <w:tcPr>
+            <w:tcW w:type="dxa" w:w="4100"/>
+            <w:tcBorders>
+              <w:top w:val="single" w:color="A6A6A6" w:sz="4"/>
+              <w:left w:val="single" w:color="A6A6A6" w:sz="4"/>
+              <w:bottom w:val="single" w:color="A6A6A6" w:sz="4"/>
+              <w:right w:val="single" w:color="A6A6A6" w:sz="4"/>
+            </w:tcBorders>
+            <w:tcMar>
+              <w:top w:type="dxa" w:w="40"/>
+              <w:left w:type="dxa" w:w="80"/>
+              <w:bottom w:type="dxa" w:w="40"/>
+              <w:right w:type="dxa" w:w="80"/>
+            </w:tcMar>
+          </w:tcPr>
+          <w:p>
+            <w:pPr>
+              <w:spacing w:after="0"/>
+            </w:pPr>
+            <w:r>
+              <w:rPr>
+                <w:rFonts w:ascii="Arial" w:cs="Arial" w:eastAsia="Arial" w:hAnsi="Arial"/>
+                <w:sz w:val="18"/>
+                <w:szCs w:val="18"/>
+              </w:rPr>
+              <w:t xml:space="preserve">Carro con cajas plásticas, una por pieza (≈23 kg en el pico)</w:t>
+            </w:r>
+          </w:p>
+        </w:tc>
+        <w:tc>
+          <w:tcPr>
+            <w:tcW w:type="dxa" w:w="3038"/>
+            <w:tcBorders>
+              <w:top w:val="single" w:color="A6A6A6" w:sz="4"/>
+              <w:left w:val="single" w:color="A6A6A6" w:sz="4"/>
+              <w:bottom w:val="single" w:color="A6A6A6" w:sz="4"/>
+              <w:right w:val="single" w:color="A6A6A6" w:sz="4"/>
+            </w:tcBorders>
+            <w:tcMar>
+              <w:top w:type="dxa" w:w="40"/>
+              <w:left w:type="dxa" w:w="80"/>
+              <w:bottom w:type="dxa" w:w="40"/>
+              <w:right w:type="dxa" w:w="80"/>
+            </w:tcMar>
+          </w:tcPr>
+          <w:p>
+            <w:pPr>
+              <w:spacing w:after="0"/>
+            </w:pPr>
+            <w:r>
+              <w:rPr>
+                <w:rFonts w:ascii="Arial" w:cs="Arial" w:eastAsia="Arial" w:hAnsi="Arial"/>
+                <w:sz w:val="18"/>
+                <w:szCs w:val="18"/>
+              </w:rPr>
+              <w:t xml:space="preserve">Balanceo › Parametros A30–A31. Medida sin fuente</w:t>
+            </w:r>
+          </w:p>
+        </w:tc>
+        <w:tc>
+          <w:tcPr>
+            <w:tcW w:type="dxa" w:w="1500"/>
             <w:tcBorders>
               <w:top w:val="single" w:color="A6A6A6" w:sz="4"/>
               <w:left w:val="single" w:color="A6A6A6" w:sz="4"/>
@@ -2094,103 +2249,103 @@
                 <w:sz w:val="18"/>
                 <w:szCs w:val="18"/>
               </w:rPr>
-              <w:t xml:space="preserve">Carro de cajas: piezas de accesorios de carros (pulmón hacia el 8.1)</w:t>
-            </w:r>
-          </w:p>
-        </w:tc>
-        <w:tc>
-          <w:tcPr>
-            <w:tcW w:type="dxa" w:w="2600"/>
-            <w:tcBorders>
-              <w:top w:val="single" w:color="A6A6A6" w:sz="4"/>
-              <w:left w:val="single" w:color="A6A6A6" w:sz="4"/>
-              <w:bottom w:val="single" w:color="A6A6A6" w:sz="4"/>
-              <w:right w:val="single" w:color="A6A6A6" w:sz="4"/>
-            </w:tcBorders>
-            <w:tcMar>
-              <w:top w:type="dxa" w:w="40"/>
-              <w:left w:type="dxa" w:w="80"/>
-              <w:bottom w:type="dxa" w:w="40"/>
-              <w:right w:type="dxa" w:w="80"/>
-            </w:tcMar>
-          </w:tcPr>
-          <w:p>
-            <w:pPr>
-              <w:spacing w:after="0"/>
-            </w:pPr>
-            <w:r>
-              <w:rPr>
-                <w:rFonts w:ascii="Arial" w:cs="Arial" w:eastAsia="Arial" w:hAnsi="Arial"/>
-                <w:sz w:val="18"/>
-                <w:szCs w:val="18"/>
-              </w:rPr>
-              <w:t xml:space="preserve">No figura</w:t>
-            </w:r>
-          </w:p>
-        </w:tc>
-        <w:tc>
-          <w:tcPr>
-            <w:tcW w:type="dxa" w:w="4300"/>
-            <w:tcBorders>
-              <w:top w:val="single" w:color="A6A6A6" w:sz="4"/>
-              <w:left w:val="single" w:color="A6A6A6" w:sz="4"/>
-              <w:bottom w:val="single" w:color="A6A6A6" w:sz="4"/>
-              <w:right w:val="single" w:color="A6A6A6" w:sz="4"/>
-            </w:tcBorders>
-            <w:tcMar>
-              <w:top w:type="dxa" w:w="40"/>
-              <w:left w:type="dxa" w:w="80"/>
-              <w:bottom w:type="dxa" w:w="40"/>
-              <w:right w:type="dxa" w:w="80"/>
-            </w:tcMar>
-          </w:tcPr>
-          <w:p>
-            <w:pPr>
-              <w:spacing w:after="0"/>
-            </w:pPr>
-            <w:r>
-              <w:rPr>
-                <w:rFonts w:ascii="Arial" w:cs="Arial" w:eastAsia="Arial" w:hAnsi="Arial"/>
-                <w:sz w:val="18"/>
-                <w:szCs w:val="18"/>
-              </w:rPr>
-              <w:t xml:space="preserve">Carro con cajas plásticas, una por pieza. El operario del 8.1 lo busca una vez por día (≈23 kg en el pico)</w:t>
-            </w:r>
-          </w:p>
-        </w:tc>
-        <w:tc>
-          <w:tcPr>
-            <w:tcW w:type="dxa" w:w="3438"/>
-            <w:tcBorders>
-              <w:top w:val="single" w:color="A6A6A6" w:sz="4"/>
-              <w:left w:val="single" w:color="A6A6A6" w:sz="4"/>
-              <w:bottom w:val="single" w:color="A6A6A6" w:sz="4"/>
-              <w:right w:val="single" w:color="A6A6A6" w:sz="4"/>
-            </w:tcBorders>
-            <w:tcMar>
-              <w:top w:type="dxa" w:w="40"/>
-              <w:left w:type="dxa" w:w="80"/>
-              <w:bottom w:type="dxa" w:w="40"/>
-              <w:right w:type="dxa" w:w="80"/>
-            </w:tcMar>
-          </w:tcPr>
-          <w:p>
-            <w:pPr>
-              <w:spacing w:after="0"/>
-            </w:pPr>
-            <w:r>
-              <w:rPr>
-                <w:rFonts w:ascii="Arial" w:cs="Arial" w:eastAsia="Arial" w:hAnsi="Arial"/>
-                <w:sz w:val="18"/>
-                <w:szCs w:val="18"/>
-              </w:rPr>
-              <w:t xml:space="preserve">Balanceo › Parametros A30–A31 · Word Carros › Salida</w:t>
-            </w:r>
-          </w:p>
-        </w:tc>
-        <w:tc>
-          <w:tcPr>
-            <w:tcW w:type="dxa" w:w="1600"/>
+              <w:t xml:space="preserve">Ventosas Hamilton VH3 (4)</w:t>
+            </w:r>
+          </w:p>
+        </w:tc>
+        <w:tc>
+          <w:tcPr>
+            <w:tcW w:type="dxa" w:w="3300"/>
+            <w:tcBorders>
+              <w:top w:val="single" w:color="A6A6A6" w:sz="4"/>
+              <w:left w:val="single" w:color="A6A6A6" w:sz="4"/>
+              <w:bottom w:val="single" w:color="A6A6A6" w:sz="4"/>
+              <w:right w:val="single" w:color="A6A6A6" w:sz="4"/>
+            </w:tcBorders>
+            <w:tcMar>
+              <w:top w:type="dxa" w:w="40"/>
+              <w:left w:type="dxa" w:w="80"/>
+              <w:bottom w:type="dxa" w:w="40"/>
+              <w:right w:type="dxa" w:w="80"/>
+            </w:tcMar>
+          </w:tcPr>
+          <w:p>
+            <w:pPr>
+              <w:spacing w:after="0"/>
+            </w:pPr>
+            <w:r>
+              <w:rPr>
+                <w:rFonts w:ascii="Arial" w:cs="Arial" w:eastAsia="Arial" w:hAnsi="Arial"/>
+                <w:sz w:val="18"/>
+                <w:szCs w:val="18"/>
+              </w:rPr>
+              <w:t xml:space="preserve">Mover la hoja sin levantarla a mano</w:t>
+            </w:r>
+          </w:p>
+        </w:tc>
+        <w:tc>
+          <w:tcPr>
+            <w:tcW w:type="dxa" w:w="4100"/>
+            <w:tcBorders>
+              <w:top w:val="single" w:color="A6A6A6" w:sz="4"/>
+              <w:left w:val="single" w:color="A6A6A6" w:sz="4"/>
+              <w:bottom w:val="single" w:color="A6A6A6" w:sz="4"/>
+              <w:right w:val="single" w:color="A6A6A6" w:sz="4"/>
+            </w:tcBorders>
+            <w:tcMar>
+              <w:top w:type="dxa" w:w="40"/>
+              <w:left w:type="dxa" w:w="80"/>
+              <w:bottom w:type="dxa" w:w="40"/>
+              <w:right w:type="dxa" w:w="80"/>
+            </w:tcMar>
+          </w:tcPr>
+          <w:p>
+            <w:pPr>
+              <w:spacing w:after="0"/>
+            </w:pPr>
+            <w:r>
+              <w:rPr>
+                <w:rFonts w:ascii="Arial" w:cs="Arial" w:eastAsia="Arial" w:hAnsi="Arial"/>
+                <w:sz w:val="18"/>
+                <w:szCs w:val="18"/>
+              </w:rPr>
+              <w:t xml:space="preserve">Estante chico o caja con tapa al lado de la G1, ventosas boca arriba, sin peso encima y fuera del sol</w:t>
+            </w:r>
+          </w:p>
+        </w:tc>
+        <w:tc>
+          <w:tcPr>
+            <w:tcW w:type="dxa" w:w="3038"/>
+            <w:tcBorders>
+              <w:top w:val="single" w:color="A6A6A6" w:sz="4"/>
+              <w:left w:val="single" w:color="A6A6A6" w:sz="4"/>
+              <w:bottom w:val="single" w:color="A6A6A6" w:sz="4"/>
+              <w:right w:val="single" w:color="A6A6A6" w:sz="4"/>
+            </w:tcBorders>
+            <w:tcMar>
+              <w:top w:type="dxa" w:w="40"/>
+              <w:left w:type="dxa" w:w="80"/>
+              <w:bottom w:type="dxa" w:w="40"/>
+              <w:right w:type="dxa" w:w="80"/>
+            </w:tcMar>
+          </w:tcPr>
+          <w:p>
+            <w:pPr>
+              <w:spacing w:after="0"/>
+            </w:pPr>
+            <w:r>
+              <w:rPr>
+                <w:rFonts w:ascii="Arial" w:cs="Arial" w:eastAsia="Arial" w:hAnsi="Arial"/>
+                <w:sz w:val="18"/>
+                <w:szCs w:val="18"/>
+              </w:rPr>
+              <w:t xml:space="preserve">Guías de ventosas Sealey y Piab</w:t>
+            </w:r>
+          </w:p>
+        </w:tc>
+        <w:tc>
+          <w:tcPr>
+            <w:tcW w:type="dxa" w:w="1500"/>
             <w:tcBorders>
               <w:top w:val="single" w:color="A6A6A6" w:sz="4"/>
               <w:left w:val="single" w:color="A6A6A6" w:sz="4"/>
@@ -2249,103 +2404,103 @@
                 <w:sz w:val="18"/>
                 <w:szCs w:val="18"/>
               </w:rPr>
-              <w:t xml:space="preserve">Ventosas Hamilton VH3 (4)</w:t>
-            </w:r>
-          </w:p>
-        </w:tc>
-        <w:tc>
-          <w:tcPr>
-            <w:tcW w:type="dxa" w:w="2600"/>
-            <w:tcBorders>
-              <w:top w:val="single" w:color="A6A6A6" w:sz="4"/>
-              <w:left w:val="single" w:color="A6A6A6" w:sz="4"/>
-              <w:bottom w:val="single" w:color="A6A6A6" w:sz="4"/>
-              <w:right w:val="single" w:color="A6A6A6" w:sz="4"/>
-            </w:tcBorders>
-            <w:tcMar>
-              <w:top w:type="dxa" w:w="40"/>
-              <w:left w:type="dxa" w:w="80"/>
-              <w:bottom w:type="dxa" w:w="40"/>
-              <w:right w:type="dxa" w:w="80"/>
-            </w:tcMar>
-          </w:tcPr>
-          <w:p>
-            <w:pPr>
-              <w:spacing w:after="0"/>
-            </w:pPr>
-            <w:r>
-              <w:rPr>
-                <w:rFonts w:ascii="Arial" w:cs="Arial" w:eastAsia="Arial" w:hAnsi="Arial"/>
-                <w:sz w:val="18"/>
-                <w:szCs w:val="18"/>
-              </w:rPr>
-              <w:t xml:space="preserve">No figuran</w:t>
-            </w:r>
-          </w:p>
-        </w:tc>
-        <w:tc>
-          <w:tcPr>
-            <w:tcW w:type="dxa" w:w="4300"/>
-            <w:tcBorders>
-              <w:top w:val="single" w:color="A6A6A6" w:sz="4"/>
-              <w:left w:val="single" w:color="A6A6A6" w:sz="4"/>
-              <w:bottom w:val="single" w:color="A6A6A6" w:sz="4"/>
-              <w:right w:val="single" w:color="A6A6A6" w:sz="4"/>
-            </w:tcBorders>
-            <w:tcMar>
-              <w:top w:type="dxa" w:w="40"/>
-              <w:left w:type="dxa" w:w="80"/>
-              <w:bottom w:type="dxa" w:w="40"/>
-              <w:right w:type="dxa" w:w="80"/>
-            </w:tcMar>
-          </w:tcPr>
-          <w:p>
-            <w:pPr>
-              <w:spacing w:after="0"/>
-            </w:pPr>
-            <w:r>
-              <w:rPr>
-                <w:rFonts w:ascii="Arial" w:cs="Arial" w:eastAsia="Arial" w:hAnsi="Arial"/>
-                <w:sz w:val="18"/>
-                <w:szCs w:val="18"/>
-              </w:rPr>
-              <w:t xml:space="preserve">Estante chico o caja con tapa al lado de la G1, ventosas boca arriba, sin peso encima y fuera del sol</w:t>
-            </w:r>
-          </w:p>
-        </w:tc>
-        <w:tc>
-          <w:tcPr>
-            <w:tcW w:type="dxa" w:w="3438"/>
-            <w:tcBorders>
-              <w:top w:val="single" w:color="A6A6A6" w:sz="4"/>
-              <w:left w:val="single" w:color="A6A6A6" w:sz="4"/>
-              <w:bottom w:val="single" w:color="A6A6A6" w:sz="4"/>
-              <w:right w:val="single" w:color="A6A6A6" w:sz="4"/>
-            </w:tcBorders>
-            <w:tcMar>
-              <w:top w:type="dxa" w:w="40"/>
-              <w:left w:type="dxa" w:w="80"/>
-              <w:bottom w:type="dxa" w:w="40"/>
-              <w:right w:type="dxa" w:w="80"/>
-            </w:tcMar>
-          </w:tcPr>
-          <w:p>
-            <w:pPr>
-              <w:spacing w:after="0"/>
-            </w:pPr>
-            <w:r>
-              <w:rPr>
-                <w:rFonts w:ascii="Arial" w:cs="Arial" w:eastAsia="Arial" w:hAnsi="Arial"/>
-                <w:sz w:val="18"/>
-                <w:szCs w:val="18"/>
-              </w:rPr>
-              <w:t xml:space="preserve">Word Carros › Equipos · guías Sealey y Piab</w:t>
-            </w:r>
-          </w:p>
-        </w:tc>
-        <w:tc>
-          <w:tcPr>
-            <w:tcW w:type="dxa" w:w="1600"/>
+              <w:t xml:space="preserve">Escuadra, cinta y calibre</w:t>
+            </w:r>
+          </w:p>
+        </w:tc>
+        <w:tc>
+          <w:tcPr>
+            <w:tcW w:type="dxa" w:w="3300"/>
+            <w:tcBorders>
+              <w:top w:val="single" w:color="A6A6A6" w:sz="4"/>
+              <w:left w:val="single" w:color="A6A6A6" w:sz="4"/>
+              <w:bottom w:val="single" w:color="A6A6A6" w:sz="4"/>
+              <w:right w:val="single" w:color="A6A6A6" w:sz="4"/>
+            </w:tcBorders>
+            <w:tcMar>
+              <w:top w:type="dxa" w:w="40"/>
+              <w:left w:type="dxa" w:w="80"/>
+              <w:bottom w:type="dxa" w:w="40"/>
+              <w:right w:type="dxa" w:w="80"/>
+            </w:tcMar>
+          </w:tcPr>
+          <w:p>
+            <w:pPr>
+              <w:spacing w:after="0"/>
+            </w:pPr>
+            <w:r>
+              <w:rPr>
+                <w:rFonts w:ascii="Arial" w:cs="Arial" w:eastAsia="Arial" w:hAnsi="Arial"/>
+                <w:sz w:val="18"/>
+                <w:szCs w:val="18"/>
+              </w:rPr>
+              <w:t xml:space="preserve">Medir la primera pieza de cada tanda</w:t>
+            </w:r>
+          </w:p>
+        </w:tc>
+        <w:tc>
+          <w:tcPr>
+            <w:tcW w:type="dxa" w:w="4100"/>
+            <w:tcBorders>
+              <w:top w:val="single" w:color="A6A6A6" w:sz="4"/>
+              <w:left w:val="single" w:color="A6A6A6" w:sz="4"/>
+              <w:bottom w:val="single" w:color="A6A6A6" w:sz="4"/>
+              <w:right w:val="single" w:color="A6A6A6" w:sz="4"/>
+            </w:tcBorders>
+            <w:tcMar>
+              <w:top w:type="dxa" w:w="40"/>
+              <w:left w:type="dxa" w:w="80"/>
+              <w:bottom w:type="dxa" w:w="40"/>
+              <w:right w:type="dxa" w:w="80"/>
+            </w:tcMar>
+          </w:tcPr>
+          <w:p>
+            <w:pPr>
+              <w:spacing w:after="0"/>
+            </w:pPr>
+            <w:r>
+              <w:rPr>
+                <w:rFonts w:ascii="Arial" w:cs="Arial" w:eastAsia="Arial" w:hAnsi="Arial"/>
+                <w:sz w:val="18"/>
+                <w:szCs w:val="18"/>
+              </w:rPr>
+              <w:t xml:space="preserve">Tablero de herramientas en el puesto. La ISO 10012 pide instrumentos calibrados e identificados</w:t>
+            </w:r>
+          </w:p>
+        </w:tc>
+        <w:tc>
+          <w:tcPr>
+            <w:tcW w:type="dxa" w:w="3038"/>
+            <w:tcBorders>
+              <w:top w:val="single" w:color="A6A6A6" w:sz="4"/>
+              <w:left w:val="single" w:color="A6A6A6" w:sz="4"/>
+              <w:bottom w:val="single" w:color="A6A6A6" w:sz="4"/>
+              <w:right w:val="single" w:color="A6A6A6" w:sz="4"/>
+            </w:tcBorders>
+            <w:tcMar>
+              <w:top w:type="dxa" w:w="40"/>
+              <w:left w:type="dxa" w:w="80"/>
+              <w:bottom w:type="dxa" w:w="40"/>
+              <w:right w:type="dxa" w:w="80"/>
+            </w:tcMar>
+          </w:tcPr>
+          <w:p>
+            <w:pPr>
+              <w:spacing w:after="0"/>
+            </w:pPr>
+            <w:r>
+              <w:rPr>
+                <w:rFonts w:ascii="Arial" w:cs="Arial" w:eastAsia="Arial" w:hAnsi="Arial"/>
+                <w:sz w:val="18"/>
+                <w:szCs w:val="18"/>
+              </w:rPr>
+              <w:t xml:space="preserve">ISO 10012</w:t>
+            </w:r>
+          </w:p>
+        </w:tc>
+        <w:tc>
+          <w:tcPr>
+            <w:tcW w:type="dxa" w:w="1500"/>
             <w:tcBorders>
               <w:top w:val="single" w:color="A6A6A6" w:sz="4"/>
               <w:left w:val="single" w:color="A6A6A6" w:sz="4"/>
@@ -2404,103 +2559,103 @@
                 <w:sz w:val="18"/>
                 <w:szCs w:val="18"/>
               </w:rPr>
-              <w:t xml:space="preserve">Escuadra, cinta y calibre (control de la primera pieza)</w:t>
-            </w:r>
-          </w:p>
-        </w:tc>
-        <w:tc>
-          <w:tcPr>
-            <w:tcW w:type="dxa" w:w="2600"/>
-            <w:tcBorders>
-              <w:top w:val="single" w:color="A6A6A6" w:sz="4"/>
-              <w:left w:val="single" w:color="A6A6A6" w:sz="4"/>
-              <w:bottom w:val="single" w:color="A6A6A6" w:sz="4"/>
-              <w:right w:val="single" w:color="A6A6A6" w:sz="4"/>
-            </w:tcBorders>
-            <w:tcMar>
-              <w:top w:type="dxa" w:w="40"/>
-              <w:left w:type="dxa" w:w="80"/>
-              <w:bottom w:type="dxa" w:w="40"/>
-              <w:right w:type="dxa" w:w="80"/>
-            </w:tcMar>
-          </w:tcPr>
-          <w:p>
-            <w:pPr>
-              <w:spacing w:after="0"/>
-            </w:pPr>
-            <w:r>
-              <w:rPr>
-                <w:rFonts w:ascii="Arial" w:cs="Arial" w:eastAsia="Arial" w:hAnsi="Arial"/>
-                <w:sz w:val="18"/>
-                <w:szCs w:val="18"/>
-              </w:rPr>
-              <w:t xml:space="preserve">No figuran (el pañol tiene estantería de herramientas)</w:t>
-            </w:r>
-          </w:p>
-        </w:tc>
-        <w:tc>
-          <w:tcPr>
-            <w:tcW w:type="dxa" w:w="4300"/>
-            <w:tcBorders>
-              <w:top w:val="single" w:color="A6A6A6" w:sz="4"/>
-              <w:left w:val="single" w:color="A6A6A6" w:sz="4"/>
-              <w:bottom w:val="single" w:color="A6A6A6" w:sz="4"/>
-              <w:right w:val="single" w:color="A6A6A6" w:sz="4"/>
-            </w:tcBorders>
-            <w:tcMar>
-              <w:top w:type="dxa" w:w="40"/>
-              <w:left w:type="dxa" w:w="80"/>
-              <w:bottom w:type="dxa" w:w="40"/>
-              <w:right w:type="dxa" w:w="80"/>
-            </w:tcMar>
-          </w:tcPr>
-          <w:p>
-            <w:pPr>
-              <w:spacing w:after="0"/>
-            </w:pPr>
-            <w:r>
-              <w:rPr>
-                <w:rFonts w:ascii="Arial" w:cs="Arial" w:eastAsia="Arial" w:hAnsi="Arial"/>
-                <w:sz w:val="18"/>
-                <w:szCs w:val="18"/>
-              </w:rPr>
-              <w:t xml:space="preserve">Tablero de herramientas en el puesto. La ISO 10012 pide instrumentos calibrados e identificados</w:t>
-            </w:r>
-          </w:p>
-        </w:tc>
-        <w:tc>
-          <w:tcPr>
-            <w:tcW w:type="dxa" w:w="3438"/>
-            <w:tcBorders>
-              <w:top w:val="single" w:color="A6A6A6" w:sz="4"/>
-              <w:left w:val="single" w:color="A6A6A6" w:sz="4"/>
-              <w:bottom w:val="single" w:color="A6A6A6" w:sz="4"/>
-              <w:right w:val="single" w:color="A6A6A6" w:sz="4"/>
-            </w:tcBorders>
-            <w:tcMar>
-              <w:top w:type="dxa" w:w="40"/>
-              <w:left w:type="dxa" w:w="80"/>
-              <w:bottom w:type="dxa" w:w="40"/>
-              <w:right w:type="dxa" w:w="80"/>
-            </w:tcMar>
-          </w:tcPr>
-          <w:p>
-            <w:pPr>
-              <w:spacing w:after="0"/>
-            </w:pPr>
-            <w:r>
-              <w:rPr>
-                <w:rFonts w:ascii="Arial" w:cs="Arial" w:eastAsia="Arial" w:hAnsi="Arial"/>
-                <w:sz w:val="18"/>
-                <w:szCs w:val="18"/>
-              </w:rPr>
-              <w:t xml:space="preserve">Word Carros › Controles · ISO 10012</w:t>
-            </w:r>
-          </w:p>
-        </w:tc>
-        <w:tc>
-          <w:tcPr>
-            <w:tcW w:type="dxa" w:w="1600"/>
+              <w:t xml:space="preserve">Tacho con tapa para trapos con aceite (Y48)</w:t>
+            </w:r>
+          </w:p>
+        </w:tc>
+        <w:tc>
+          <w:tcPr>
+            <w:tcW w:type="dxa" w:w="3300"/>
+            <w:tcBorders>
+              <w:top w:val="single" w:color="A6A6A6" w:sz="4"/>
+              <w:left w:val="single" w:color="A6A6A6" w:sz="4"/>
+              <w:bottom w:val="single" w:color="A6A6A6" w:sz="4"/>
+              <w:right w:val="single" w:color="A6A6A6" w:sz="4"/>
+            </w:tcBorders>
+            <w:tcMar>
+              <w:top w:type="dxa" w:w="40"/>
+              <w:left w:type="dxa" w:w="80"/>
+              <w:bottom w:type="dxa" w:w="40"/>
+              <w:right w:type="dxa" w:w="80"/>
+            </w:tcMar>
+          </w:tcPr>
+          <w:p>
+            <w:pPr>
+              <w:spacing w:after="0"/>
+            </w:pPr>
+            <w:r>
+              <w:rPr>
+                <w:rFonts w:ascii="Arial" w:cs="Arial" w:eastAsia="Arial" w:hAnsi="Arial"/>
+                <w:sz w:val="18"/>
+                <w:szCs w:val="18"/>
+              </w:rPr>
+              <w:t xml:space="preserve">Limpieza y lubricación</w:t>
+            </w:r>
+          </w:p>
+        </w:tc>
+        <w:tc>
+          <w:tcPr>
+            <w:tcW w:type="dxa" w:w="4100"/>
+            <w:tcBorders>
+              <w:top w:val="single" w:color="A6A6A6" w:sz="4"/>
+              <w:left w:val="single" w:color="A6A6A6" w:sz="4"/>
+              <w:bottom w:val="single" w:color="A6A6A6" w:sz="4"/>
+              <w:right w:val="single" w:color="A6A6A6" w:sz="4"/>
+            </w:tcBorders>
+            <w:tcMar>
+              <w:top w:type="dxa" w:w="40"/>
+              <w:left w:type="dxa" w:w="80"/>
+              <w:bottom w:type="dxa" w:w="40"/>
+              <w:right w:type="dxa" w:w="80"/>
+            </w:tcMar>
+          </w:tcPr>
+          <w:p>
+            <w:pPr>
+              <w:spacing w:after="0"/>
+            </w:pPr>
+            <w:r>
+              <w:rPr>
+                <w:rFonts w:ascii="Arial" w:cs="Arial" w:eastAsia="Arial" w:hAnsi="Arial"/>
+                <w:sz w:val="18"/>
+                <w:szCs w:val="18"/>
+              </w:rPr>
+              <w:t xml:space="preserve">Tacho chico en el puesto. El aceite hidráulico (Y8) se maneja en mantenimiento</w:t>
+            </w:r>
+          </w:p>
+        </w:tc>
+        <w:tc>
+          <w:tcPr>
+            <w:tcW w:type="dxa" w:w="3038"/>
+            <w:tcBorders>
+              <w:top w:val="single" w:color="A6A6A6" w:sz="4"/>
+              <w:left w:val="single" w:color="A6A6A6" w:sz="4"/>
+              <w:bottom w:val="single" w:color="A6A6A6" w:sz="4"/>
+              <w:right w:val="single" w:color="A6A6A6" w:sz="4"/>
+            </w:tcBorders>
+            <w:tcMar>
+              <w:top w:type="dxa" w:w="40"/>
+              <w:left w:type="dxa" w:w="80"/>
+              <w:bottom w:type="dxa" w:w="40"/>
+              <w:right w:type="dxa" w:w="80"/>
+            </w:tcMar>
+          </w:tcPr>
+          <w:p>
+            <w:pPr>
+              <w:spacing w:after="0"/>
+            </w:pPr>
+            <w:r>
+              <w:rPr>
+                <w:rFonts w:ascii="Arial" w:cs="Arial" w:eastAsia="Arial" w:hAnsi="Arial"/>
+                <w:sz w:val="18"/>
+                <w:szCs w:val="18"/>
+              </w:rPr>
+              <w:t xml:space="preserve">Ley 24.051 · Res. 897/2002</w:t>
+            </w:r>
+          </w:p>
+        </w:tc>
+        <w:tc>
+          <w:tcPr>
+            <w:tcW w:type="dxa" w:w="1500"/>
             <w:tcBorders>
               <w:top w:val="single" w:color="A6A6A6" w:sz="4"/>
               <w:left w:val="single" w:color="A6A6A6" w:sz="4"/>
@@ -2559,258 +2714,103 @@
                 <w:sz w:val="18"/>
                 <w:szCs w:val="18"/>
               </w:rPr>
-              <w:t xml:space="preserve">Tacho con tapa para trapos con aceite (Y48)</w:t>
-            </w:r>
-          </w:p>
-        </w:tc>
-        <w:tc>
-          <w:tcPr>
-            <w:tcW w:type="dxa" w:w="2600"/>
-            <w:tcBorders>
-              <w:top w:val="single" w:color="A6A6A6" w:sz="4"/>
-              <w:left w:val="single" w:color="A6A6A6" w:sz="4"/>
-              <w:bottom w:val="single" w:color="A6A6A6" w:sz="4"/>
-              <w:right w:val="single" w:color="A6A6A6" w:sz="4"/>
-            </w:tcBorders>
-            <w:tcMar>
-              <w:top w:type="dxa" w:w="40"/>
-              <w:left w:type="dxa" w:w="80"/>
-              <w:bottom w:type="dxa" w:w="40"/>
-              <w:right w:type="dxa" w:w="80"/>
-            </w:tcMar>
-          </w:tcPr>
-          <w:p>
-            <w:pPr>
-              <w:spacing w:after="0"/>
-            </w:pPr>
-            <w:r>
-              <w:rPr>
-                <w:rFonts w:ascii="Arial" w:cs="Arial" w:eastAsia="Arial" w:hAnsi="Arial"/>
-                <w:sz w:val="18"/>
-                <w:szCs w:val="18"/>
-              </w:rPr>
-              <w:t xml:space="preserve">No figura (el aceite usado está en mantenimiento)</w:t>
-            </w:r>
-          </w:p>
-        </w:tc>
-        <w:tc>
-          <w:tcPr>
-            <w:tcW w:type="dxa" w:w="4300"/>
-            <w:tcBorders>
-              <w:top w:val="single" w:color="A6A6A6" w:sz="4"/>
-              <w:left w:val="single" w:color="A6A6A6" w:sz="4"/>
-              <w:bottom w:val="single" w:color="A6A6A6" w:sz="4"/>
-              <w:right w:val="single" w:color="A6A6A6" w:sz="4"/>
-            </w:tcBorders>
-            <w:tcMar>
-              <w:top w:type="dxa" w:w="40"/>
-              <w:left w:type="dxa" w:w="80"/>
-              <w:bottom w:type="dxa" w:w="40"/>
-              <w:right w:type="dxa" w:w="80"/>
-            </w:tcMar>
-          </w:tcPr>
-          <w:p>
-            <w:pPr>
-              <w:spacing w:after="0"/>
-            </w:pPr>
-            <w:r>
-              <w:rPr>
-                <w:rFonts w:ascii="Arial" w:cs="Arial" w:eastAsia="Arial" w:hAnsi="Arial"/>
-                <w:sz w:val="18"/>
-                <w:szCs w:val="18"/>
-              </w:rPr>
-              <w:t xml:space="preserve">Tacho chico en el puesto. El aceite hidráulico (Y8) se maneja en mantenimiento</w:t>
-            </w:r>
-          </w:p>
-        </w:tc>
-        <w:tc>
-          <w:tcPr>
-            <w:tcW w:type="dxa" w:w="3438"/>
-            <w:tcBorders>
-              <w:top w:val="single" w:color="A6A6A6" w:sz="4"/>
-              <w:left w:val="single" w:color="A6A6A6" w:sz="4"/>
-              <w:bottom w:val="single" w:color="A6A6A6" w:sz="4"/>
-              <w:right w:val="single" w:color="A6A6A6" w:sz="4"/>
-            </w:tcBorders>
-            <w:tcMar>
-              <w:top w:type="dxa" w:w="40"/>
-              <w:left w:type="dxa" w:w="80"/>
-              <w:bottom w:type="dxa" w:w="40"/>
-              <w:right w:type="dxa" w:w="80"/>
-            </w:tcMar>
-          </w:tcPr>
-          <w:p>
-            <w:pPr>
-              <w:spacing w:after="0"/>
-            </w:pPr>
-            <w:r>
-              <w:rPr>
-                <w:rFonts w:ascii="Arial" w:cs="Arial" w:eastAsia="Arial" w:hAnsi="Arial"/>
-                <w:sz w:val="18"/>
-                <w:szCs w:val="18"/>
-              </w:rPr>
-              <w:t xml:space="preserve">Ley 24.051 · Res. 897/2002</w:t>
-            </w:r>
-          </w:p>
-        </w:tc>
-        <w:tc>
-          <w:tcPr>
-            <w:tcW w:type="dxa" w:w="1600"/>
-            <w:tcBorders>
-              <w:top w:val="single" w:color="A6A6A6" w:sz="4"/>
-              <w:left w:val="single" w:color="A6A6A6" w:sz="4"/>
-              <w:bottom w:val="single" w:color="A6A6A6" w:sz="4"/>
-              <w:right w:val="single" w:color="A6A6A6" w:sz="4"/>
-            </w:tcBorders>
-            <w:tcMar>
-              <w:top w:type="dxa" w:w="40"/>
-              <w:left w:type="dxa" w:w="80"/>
-              <w:bottom w:type="dxa" w:w="40"/>
-              <w:right w:type="dxa" w:w="80"/>
-            </w:tcMar>
-          </w:tcPr>
-          <w:p>
-            <w:pPr>
-              <w:spacing w:after="0"/>
-            </w:pPr>
-            <w:r>
-              <w:rPr>
-                <w:rFonts w:ascii="Arial" w:cs="Arial" w:eastAsia="Arial" w:hAnsi="Arial"/>
-                <w:b/>
-                <w:bCs/>
-                <w:color w:val="C00000"/>
-                <w:sz w:val="18"/>
-                <w:szCs w:val="18"/>
-              </w:rPr>
-              <w:t xml:space="preserve">Falta</w:t>
-            </w:r>
-          </w:p>
-        </w:tc>
-      </w:tr>
-      <w:tr>
-        <w:tc>
-          <w:tcPr>
-            <w:tcW w:type="dxa" w:w="2900"/>
-            <w:tcBorders>
-              <w:top w:val="single" w:color="A6A6A6" w:sz="4"/>
-              <w:left w:val="single" w:color="A6A6A6" w:sz="4"/>
-              <w:bottom w:val="single" w:color="A6A6A6" w:sz="4"/>
-              <w:right w:val="single" w:color="A6A6A6" w:sz="4"/>
-            </w:tcBorders>
-            <w:tcMar>
-              <w:top w:type="dxa" w:w="40"/>
-              <w:left w:type="dxa" w:w="80"/>
-              <w:bottom w:type="dxa" w:w="40"/>
-              <w:right w:type="dxa" w:w="80"/>
-            </w:tcMar>
-          </w:tcPr>
-          <w:p>
-            <w:pPr>
-              <w:spacing w:after="0"/>
-            </w:pPr>
-            <w:r>
-              <w:rPr>
-                <w:rFonts w:ascii="Arial" w:cs="Arial" w:eastAsia="Arial" w:hAnsi="Arial"/>
-                <w:sz w:val="18"/>
-                <w:szCs w:val="18"/>
-              </w:rPr>
-              <w:t xml:space="preserve">Lugar del operario</w:t>
-            </w:r>
-          </w:p>
-        </w:tc>
-        <w:tc>
-          <w:tcPr>
-            <w:tcW w:type="dxa" w:w="2600"/>
-            <w:tcBorders>
-              <w:top w:val="single" w:color="A6A6A6" w:sz="4"/>
-              <w:left w:val="single" w:color="A6A6A6" w:sz="4"/>
-              <w:bottom w:val="single" w:color="A6A6A6" w:sz="4"/>
-              <w:right w:val="single" w:color="A6A6A6" w:sz="4"/>
-            </w:tcBorders>
-            <w:tcMar>
-              <w:top w:type="dxa" w:w="40"/>
-              <w:left w:type="dxa" w:w="80"/>
-              <w:bottom w:type="dxa" w:w="40"/>
-              <w:right w:type="dxa" w:w="80"/>
-            </w:tcMar>
-          </w:tcPr>
-          <w:p>
-            <w:pPr>
-              <w:spacing w:after="0"/>
-            </w:pPr>
-            <w:r>
-              <w:rPr>
-                <w:rFonts w:ascii="Arial" w:cs="Arial" w:eastAsia="Arial" w:hAnsi="Arial"/>
-                <w:sz w:val="18"/>
-                <w:szCs w:val="18"/>
-              </w:rPr>
-              <w:t xml:space="preserve">1,45 m</w:t>
-            </w:r>
-          </w:p>
-        </w:tc>
-        <w:tc>
-          <w:tcPr>
-            <w:tcW w:type="dxa" w:w="4300"/>
-            <w:tcBorders>
-              <w:top w:val="single" w:color="A6A6A6" w:sz="4"/>
-              <w:left w:val="single" w:color="A6A6A6" w:sz="4"/>
-              <w:bottom w:val="single" w:color="A6A6A6" w:sz="4"/>
-              <w:right w:val="single" w:color="A6A6A6" w:sz="4"/>
-            </w:tcBorders>
-            <w:tcMar>
-              <w:top w:type="dxa" w:w="40"/>
-              <w:left w:type="dxa" w:w="80"/>
-              <w:bottom w:type="dxa" w:w="40"/>
-              <w:right w:type="dxa" w:w="80"/>
-            </w:tcMar>
-          </w:tcPr>
-          <w:p>
-            <w:pPr>
-              <w:spacing w:after="0"/>
-            </w:pPr>
-            <w:r>
-              <w:rPr>
-                <w:rFonts w:ascii="Arial" w:cs="Arial" w:eastAsia="Arial" w:hAnsi="Arial"/>
-                <w:sz w:val="18"/>
-                <w:szCs w:val="18"/>
-              </w:rPr>
-              <w:t xml:space="preserve">No hay norma que fije la medida; se mantiene como criterio de diseño</w:t>
-            </w:r>
-          </w:p>
-        </w:tc>
-        <w:tc>
-          <w:tcPr>
-            <w:tcW w:type="dxa" w:w="3438"/>
-            <w:tcBorders>
-              <w:top w:val="single" w:color="A6A6A6" w:sz="4"/>
-              <w:left w:val="single" w:color="A6A6A6" w:sz="4"/>
-              <w:bottom w:val="single" w:color="A6A6A6" w:sz="4"/>
-              <w:right w:val="single" w:color="A6A6A6" w:sz="4"/>
-            </w:tcBorders>
-            <w:tcMar>
-              <w:top w:type="dxa" w:w="40"/>
-              <w:left w:type="dxa" w:w="80"/>
-              <w:bottom w:type="dxa" w:w="40"/>
-              <w:right w:type="dxa" w:w="80"/>
-            </w:tcMar>
-          </w:tcPr>
-          <w:p>
-            <w:pPr>
-              <w:spacing w:after="0"/>
-            </w:pPr>
-            <w:r>
-              <w:rPr>
-                <w:rFonts w:ascii="Arial" w:cs="Arial" w:eastAsia="Arial" w:hAnsi="Arial"/>
-                <w:sz w:val="18"/>
-                <w:szCs w:val="18"/>
-              </w:rPr>
-              <w:t xml:space="preserve">Plano</w:t>
-            </w:r>
-          </w:p>
-        </w:tc>
-        <w:tc>
-          <w:tcPr>
-            <w:tcW w:type="dxa" w:w="1600"/>
+              <w:t xml:space="preserve">Lugar del operario frente a la máquina</w:t>
+            </w:r>
+          </w:p>
+        </w:tc>
+        <w:tc>
+          <w:tcPr>
+            <w:tcW w:type="dxa" w:w="3300"/>
+            <w:tcBorders>
+              <w:top w:val="single" w:color="A6A6A6" w:sz="4"/>
+              <w:left w:val="single" w:color="A6A6A6" w:sz="4"/>
+              <w:bottom w:val="single" w:color="A6A6A6" w:sz="4"/>
+              <w:right w:val="single" w:color="A6A6A6" w:sz="4"/>
+            </w:tcBorders>
+            <w:tcMar>
+              <w:top w:type="dxa" w:w="40"/>
+              <w:left w:type="dxa" w:w="80"/>
+              <w:bottom w:type="dxa" w:w="40"/>
+              <w:right w:type="dxa" w:w="80"/>
+            </w:tcMar>
+          </w:tcPr>
+          <w:p>
+            <w:pPr>
+              <w:spacing w:after="0"/>
+            </w:pPr>
+            <w:r>
+              <w:rPr>
+                <w:rFonts w:ascii="Arial" w:cs="Arial" w:eastAsia="Arial" w:hAnsi="Arial"/>
+                <w:sz w:val="18"/>
+                <w:szCs w:val="18"/>
+              </w:rPr>
+              <w:t xml:space="preserve">Operar la máquina; 2 personas si la hoja es de 3,2 mm o más</w:t>
+            </w:r>
+          </w:p>
+        </w:tc>
+        <w:tc>
+          <w:tcPr>
+            <w:tcW w:type="dxa" w:w="4100"/>
+            <w:tcBorders>
+              <w:top w:val="single" w:color="A6A6A6" w:sz="4"/>
+              <w:left w:val="single" w:color="A6A6A6" w:sz="4"/>
+              <w:bottom w:val="single" w:color="A6A6A6" w:sz="4"/>
+              <w:right w:val="single" w:color="A6A6A6" w:sz="4"/>
+            </w:tcBorders>
+            <w:tcMar>
+              <w:top w:type="dxa" w:w="40"/>
+              <w:left w:type="dxa" w:w="80"/>
+              <w:bottom w:type="dxa" w:w="40"/>
+              <w:right w:type="dxa" w:w="80"/>
+            </w:tcMar>
+          </w:tcPr>
+          <w:p>
+            <w:pPr>
+              <w:spacing w:after="0"/>
+            </w:pPr>
+            <w:r>
+              <w:rPr>
+                <w:rFonts w:ascii="Arial" w:cs="Arial" w:eastAsia="Arial" w:hAnsi="Arial"/>
+                <w:sz w:val="18"/>
+                <w:szCs w:val="18"/>
+              </w:rPr>
+              <w:t xml:space="preserve">No se encontró norma con una medida</w:t>
+            </w:r>
+          </w:p>
+        </w:tc>
+        <w:tc>
+          <w:tcPr>
+            <w:tcW w:type="dxa" w:w="3038"/>
+            <w:tcBorders>
+              <w:top w:val="single" w:color="A6A6A6" w:sz="4"/>
+              <w:left w:val="single" w:color="A6A6A6" w:sz="4"/>
+              <w:bottom w:val="single" w:color="A6A6A6" w:sz="4"/>
+              <w:right w:val="single" w:color="A6A6A6" w:sz="4"/>
+            </w:tcBorders>
+            <w:tcMar>
+              <w:top w:type="dxa" w:w="40"/>
+              <w:left w:type="dxa" w:w="80"/>
+              <w:bottom w:type="dxa" w:w="40"/>
+              <w:right w:type="dxa" w:w="80"/>
+            </w:tcMar>
+          </w:tcPr>
+          <w:p>
+            <w:pPr>
+              <w:spacing w:after="0"/>
+            </w:pPr>
+            <w:r>
+              <w:rPr>
+                <w:rFonts w:ascii="Arial" w:cs="Arial" w:eastAsia="Arial" w:hAnsi="Arial"/>
+                <w:sz w:val="18"/>
+                <w:szCs w:val="18"/>
+              </w:rPr>
+              <w:t xml:space="preserve">Sin fuente</w:t>
+            </w:r>
+          </w:p>
+        </w:tc>
+        <w:tc>
+          <w:tcPr>
+            <w:tcW w:type="dxa" w:w="1500"/>
             <w:tcBorders>
               <w:top w:val="single" w:color="A6A6A6" w:sz="4"/>
               <w:left w:val="single" w:color="A6A6A6" w:sz="4"/>
@@ -2886,10 +2886,10 @@
       </w:tblPr>
       <w:tblGrid>
         <w:gridCol w:w="2900"/>
-        <w:gridCol w:w="2600"/>
-        <w:gridCol w:w="4300"/>
-        <w:gridCol w:w="3438"/>
-        <w:gridCol w:w="1600"/>
+        <w:gridCol w:w="3300"/>
+        <w:gridCol w:w="4100"/>
+        <w:gridCol w:w="3038"/>
+        <w:gridCol w:w="1500"/>
       </w:tblGrid>
       <w:tr>
         <w:trPr>
@@ -2930,7 +2930,7 @@
         </w:tc>
         <w:tc>
           <w:tcPr>
-            <w:tcW w:type="dxa" w:w="2600"/>
+            <w:tcW w:type="dxa" w:w="3300"/>
             <w:tcBorders>
               <w:top w:val="single" w:color="A6A6A6" w:sz="4"/>
               <w:left w:val="single" w:color="A6A6A6" w:sz="4"/>
@@ -2957,13 +2957,13 @@
                 <w:sz w:val="18"/>
                 <w:szCs w:val="18"/>
               </w:rPr>
-              <w:t xml:space="preserve">En el plano rev23</w:t>
-            </w:r>
-          </w:p>
-        </w:tc>
-        <w:tc>
-          <w:tcPr>
-            <w:tcW w:type="dxa" w:w="4300"/>
+              <w:t xml:space="preserve">Qué pide el proceso</w:t>
+            </w:r>
+          </w:p>
+        </w:tc>
+        <w:tc>
+          <w:tcPr>
+            <w:tcW w:type="dxa" w:w="4100"/>
             <w:tcBorders>
               <w:top w:val="single" w:color="A6A6A6" w:sz="4"/>
               <w:left w:val="single" w:color="A6A6A6" w:sz="4"/>
@@ -2990,13 +2990,13 @@
                 <w:sz w:val="18"/>
                 <w:szCs w:val="18"/>
               </w:rPr>
-              <w:t xml:space="preserve">Propuesta</w:t>
-            </w:r>
-          </w:p>
-        </w:tc>
-        <w:tc>
-          <w:tcPr>
-            <w:tcW w:type="dxa" w:w="3438"/>
+              <w:t xml:space="preserve">Propuesta y medida</w:t>
+            </w:r>
+          </w:p>
+        </w:tc>
+        <w:tc>
+          <w:tcPr>
+            <w:tcW w:type="dxa" w:w="3038"/>
             <w:tcBorders>
               <w:top w:val="single" w:color="A6A6A6" w:sz="4"/>
               <w:left w:val="single" w:color="A6A6A6" w:sz="4"/>
@@ -3023,13 +3023,13 @@
                 <w:sz w:val="18"/>
                 <w:szCs w:val="18"/>
               </w:rPr>
-              <w:t xml:space="preserve">De dónde sale</w:t>
-            </w:r>
-          </w:p>
-        </w:tc>
-        <w:tc>
-          <w:tcPr>
-            <w:tcW w:type="dxa" w:w="1600"/>
+              <w:t xml:space="preserve">Fuente de la medida</w:t>
+            </w:r>
+          </w:p>
+        </w:tc>
+        <w:tc>
+          <w:tcPr>
+            <w:tcW w:type="dxa" w:w="1500"/>
             <w:tcBorders>
               <w:top w:val="single" w:color="A6A6A6" w:sz="4"/>
               <w:left w:val="single" w:color="A6A6A6" w:sz="4"/>
@@ -3094,67 +3094,67 @@
         </w:tc>
         <w:tc>
           <w:tcPr>
-            <w:tcW w:type="dxa" w:w="2600"/>
-            <w:tcBorders>
-              <w:top w:val="single" w:color="A6A6A6" w:sz="4"/>
-              <w:left w:val="single" w:color="A6A6A6" w:sz="4"/>
-              <w:bottom w:val="single" w:color="A6A6A6" w:sz="4"/>
-              <w:right w:val="single" w:color="A6A6A6" w:sz="4"/>
-            </w:tcBorders>
-            <w:tcMar>
-              <w:top w:type="dxa" w:w="40"/>
-              <w:left w:type="dxa" w:w="80"/>
-              <w:bottom w:type="dxa" w:w="40"/>
-              <w:right w:type="dxa" w:w="80"/>
-            </w:tcMar>
-          </w:tcPr>
-          <w:p>
-            <w:pPr>
-              <w:spacing w:after="0"/>
-            </w:pPr>
-            <w:r>
-              <w:rPr>
-                <w:rFonts w:ascii="Arial" w:cs="Arial" w:eastAsia="Arial" w:hAnsi="Arial"/>
-                <w:sz w:val="18"/>
-                <w:szCs w:val="18"/>
-              </w:rPr>
-              <w:t xml:space="preserve">1,61 × 3,04 m</w:t>
-            </w:r>
-          </w:p>
-        </w:tc>
-        <w:tc>
-          <w:tcPr>
-            <w:tcW w:type="dxa" w:w="4300"/>
-            <w:tcBorders>
-              <w:top w:val="single" w:color="A6A6A6" w:sz="4"/>
-              <w:left w:val="single" w:color="A6A6A6" w:sz="4"/>
-              <w:bottom w:val="single" w:color="A6A6A6" w:sz="4"/>
-              <w:right w:val="single" w:color="A6A6A6" w:sz="4"/>
-            </w:tcBorders>
-            <w:tcMar>
-              <w:top w:type="dxa" w:w="40"/>
-              <w:left w:type="dxa" w:w="80"/>
-              <w:bottom w:type="dxa" w:w="40"/>
-              <w:right w:type="dxa" w:w="80"/>
-            </w:tcMar>
-          </w:tcPr>
-          <w:p>
-            <w:pPr>
-              <w:spacing w:after="0"/>
-            </w:pPr>
-            <w:r>
-              <w:rPr>
-                <w:rFonts w:ascii="Arial" w:cs="Arial" w:eastAsia="Arial" w:hAnsi="Arial"/>
-                <w:sz w:val="18"/>
-                <w:szCs w:val="18"/>
-              </w:rPr>
-              <w:t xml:space="preserve">3,10 × 1,62 × 1,60 m: el plano la dibuja 6 cm más corta</w:t>
-            </w:r>
-          </w:p>
-        </w:tc>
-        <w:tc>
-          <w:tcPr>
-            <w:tcW w:type="dxa" w:w="3438"/>
+            <w:tcW w:type="dxa" w:w="3300"/>
+            <w:tcBorders>
+              <w:top w:val="single" w:color="A6A6A6" w:sz="4"/>
+              <w:left w:val="single" w:color="A6A6A6" w:sz="4"/>
+              <w:bottom w:val="single" w:color="A6A6A6" w:sz="4"/>
+              <w:right w:val="single" w:color="A6A6A6" w:sz="4"/>
+            </w:tcBorders>
+            <w:tcMar>
+              <w:top w:type="dxa" w:w="40"/>
+              <w:left w:type="dxa" w:w="80"/>
+              <w:bottom w:type="dxa" w:w="40"/>
+              <w:right w:type="dxa" w:w="80"/>
+            </w:tcMar>
+          </w:tcPr>
+          <w:p>
+            <w:pPr>
+              <w:spacing w:after="0"/>
+            </w:pPr>
+            <w:r>
+              <w:rPr>
+                <w:rFonts w:ascii="Arial" w:cs="Arial" w:eastAsia="Arial" w:hAnsi="Arial"/>
+                <w:sz w:val="18"/>
+                <w:szCs w:val="18"/>
+              </w:rPr>
+              <w:t xml:space="preserve">Corta las franjas en piezas</w:t>
+            </w:r>
+          </w:p>
+        </w:tc>
+        <w:tc>
+          <w:tcPr>
+            <w:tcW w:type="dxa" w:w="4100"/>
+            <w:tcBorders>
+              <w:top w:val="single" w:color="A6A6A6" w:sz="4"/>
+              <w:left w:val="single" w:color="A6A6A6" w:sz="4"/>
+              <w:bottom w:val="single" w:color="A6A6A6" w:sz="4"/>
+              <w:right w:val="single" w:color="A6A6A6" w:sz="4"/>
+            </w:tcBorders>
+            <w:tcMar>
+              <w:top w:type="dxa" w:w="40"/>
+              <w:left w:type="dxa" w:w="80"/>
+              <w:bottom w:type="dxa" w:w="40"/>
+              <w:right w:type="dxa" w:w="80"/>
+            </w:tcMar>
+          </w:tcPr>
+          <w:p>
+            <w:pPr>
+              <w:spacing w:after="0"/>
+            </w:pPr>
+            <w:r>
+              <w:rPr>
+                <w:rFonts w:ascii="Arial" w:cs="Arial" w:eastAsia="Arial" w:hAnsi="Arial"/>
+                <w:sz w:val="18"/>
+                <w:szCs w:val="18"/>
+              </w:rPr>
+              <w:t xml:space="preserve">3,10 × 1,62 × 1,60 m</w:t>
+            </w:r>
+          </w:p>
+        </w:tc>
+        <w:tc>
+          <w:tcPr>
+            <w:tcW w:type="dxa" w:w="3038"/>
             <w:tcBorders>
               <w:top w:val="single" w:color="A6A6A6" w:sz="4"/>
               <w:left w:val="single" w:color="A6A6A6" w:sz="4"/>
@@ -3184,7 +3184,7 @@
         </w:tc>
         <w:tc>
           <w:tcPr>
-            <w:tcW w:type="dxa" w:w="1600"/>
+            <w:tcW w:type="dxa" w:w="1500"/>
             <w:tcBorders>
               <w:top w:val="single" w:color="A6A6A6" w:sz="4"/>
               <w:left w:val="single" w:color="A6A6A6" w:sz="4"/>
@@ -3207,11 +3207,11 @@
                 <w:rFonts w:ascii="Arial" w:cs="Arial" w:eastAsia="Arial" w:hAnsi="Arial"/>
                 <w:b/>
                 <w:bCs/>
-                <w:color w:val="C55A11"/>
-                <w:sz w:val="18"/>
-                <w:szCs w:val="18"/>
-              </w:rPr>
-              <w:t xml:space="preserve">Mal dimensionado</w:t>
+                <w:color w:val="375623"/>
+                <w:sz w:val="18"/>
+                <w:szCs w:val="18"/>
+              </w:rPr>
+              <w:t xml:space="preserve">OK</w:t>
             </w:r>
           </w:p>
         </w:tc>
@@ -3249,97 +3249,97 @@
         </w:tc>
         <w:tc>
           <w:tcPr>
-            <w:tcW w:type="dxa" w:w="2600"/>
-            <w:tcBorders>
-              <w:top w:val="single" w:color="A6A6A6" w:sz="4"/>
-              <w:left w:val="single" w:color="A6A6A6" w:sz="4"/>
-              <w:bottom w:val="single" w:color="A6A6A6" w:sz="4"/>
-              <w:right w:val="single" w:color="A6A6A6" w:sz="4"/>
-            </w:tcBorders>
-            <w:tcMar>
-              <w:top w:type="dxa" w:w="40"/>
-              <w:left w:type="dxa" w:w="80"/>
-              <w:bottom w:type="dxa" w:w="40"/>
-              <w:right w:type="dxa" w:w="80"/>
-            </w:tcMar>
-          </w:tcPr>
-          <w:p>
-            <w:pPr>
-              <w:spacing w:after="0"/>
-            </w:pPr>
-            <w:r>
-              <w:rPr>
-                <w:rFonts w:ascii="Arial" w:cs="Arial" w:eastAsia="Arial" w:hAnsi="Arial"/>
-                <w:sz w:val="18"/>
-                <w:szCs w:val="18"/>
-              </w:rPr>
-              <w:t xml:space="preserve">SJG3.0-1.6, 2,6 × 1,8 m</w:t>
-            </w:r>
-          </w:p>
-        </w:tc>
-        <w:tc>
-          <w:tcPr>
-            <w:tcW w:type="dxa" w:w="4300"/>
-            <w:tcBorders>
-              <w:top w:val="single" w:color="A6A6A6" w:sz="4"/>
-              <w:left w:val="single" w:color="A6A6A6" w:sz="4"/>
-              <w:bottom w:val="single" w:color="A6A6A6" w:sz="4"/>
-              <w:right w:val="single" w:color="A6A6A6" w:sz="4"/>
-            </w:tcBorders>
-            <w:tcMar>
-              <w:top w:type="dxa" w:w="40"/>
-              <w:left w:type="dxa" w:w="80"/>
-              <w:bottom w:type="dxa" w:w="40"/>
-              <w:right w:type="dxa" w:w="80"/>
-            </w:tcMar>
-          </w:tcPr>
-          <w:p>
-            <w:pPr>
-              <w:spacing w:after="0"/>
-            </w:pPr>
-            <w:r>
-              <w:rPr>
-                <w:rFonts w:ascii="Arial" w:cs="Arial" w:eastAsia="Arial" w:hAnsi="Arial"/>
-                <w:sz w:val="18"/>
-                <w:szCs w:val="18"/>
-              </w:rPr>
-              <w:t xml:space="preserve">En la planilla figura un equivalente de 2,5 × 1,3 m. Unificar con la SJG de 2,6 × 1,8 m del plano</w:t>
-            </w:r>
-          </w:p>
-        </w:tc>
-        <w:tc>
-          <w:tcPr>
-            <w:tcW w:type="dxa" w:w="3438"/>
-            <w:tcBorders>
-              <w:top w:val="single" w:color="A6A6A6" w:sz="4"/>
-              <w:left w:val="single" w:color="A6A6A6" w:sz="4"/>
-              <w:bottom w:val="single" w:color="A6A6A6" w:sz="4"/>
-              <w:right w:val="single" w:color="A6A6A6" w:sz="4"/>
-            </w:tcBorders>
-            <w:tcMar>
-              <w:top w:type="dxa" w:w="40"/>
-              <w:left w:type="dxa" w:w="80"/>
-              <w:bottom w:type="dxa" w:w="40"/>
-              <w:right w:type="dxa" w:w="80"/>
-            </w:tcMar>
-          </w:tcPr>
-          <w:p>
-            <w:pPr>
-              <w:spacing w:after="0"/>
-            </w:pPr>
-            <w:r>
-              <w:rPr>
-                <w:rFonts w:ascii="Arial" w:cs="Arial" w:eastAsia="Arial" w:hAnsi="Arial"/>
-                <w:sz w:val="18"/>
-                <w:szCs w:val="18"/>
-              </w:rPr>
-              <w:t xml:space="preserve">Pulmones I6 · plano · fabricante SJG</w:t>
-            </w:r>
-          </w:p>
-        </w:tc>
-        <w:tc>
-          <w:tcPr>
-            <w:tcW w:type="dxa" w:w="1600"/>
+            <w:tcW w:type="dxa" w:w="3300"/>
+            <w:tcBorders>
+              <w:top w:val="single" w:color="A6A6A6" w:sz="4"/>
+              <w:left w:val="single" w:color="A6A6A6" w:sz="4"/>
+              <w:bottom w:val="single" w:color="A6A6A6" w:sz="4"/>
+              <w:right w:val="single" w:color="A6A6A6" w:sz="4"/>
+            </w:tcBorders>
+            <w:tcMar>
+              <w:top w:type="dxa" w:w="40"/>
+              <w:left w:type="dxa" w:w="80"/>
+              <w:bottom w:type="dxa" w:w="40"/>
+              <w:right w:type="dxa" w:w="80"/>
+            </w:tcMar>
+          </w:tcPr>
+          <w:p>
+            <w:pPr>
+              <w:spacing w:after="0"/>
+            </w:pPr>
+            <w:r>
+              <w:rPr>
+                <w:rFonts w:ascii="Arial" w:cs="Arial" w:eastAsia="Arial" w:hAnsi="Arial"/>
+                <w:sz w:val="18"/>
+                <w:szCs w:val="18"/>
+              </w:rPr>
+              <w:t xml:space="preserve">Pulmón entre la G1 y la G2</w:t>
+            </w:r>
+          </w:p>
+        </w:tc>
+        <w:tc>
+          <w:tcPr>
+            <w:tcW w:type="dxa" w:w="4100"/>
+            <w:tcBorders>
+              <w:top w:val="single" w:color="A6A6A6" w:sz="4"/>
+              <w:left w:val="single" w:color="A6A6A6" w:sz="4"/>
+              <w:bottom w:val="single" w:color="A6A6A6" w:sz="4"/>
+              <w:right w:val="single" w:color="A6A6A6" w:sz="4"/>
+            </w:tcBorders>
+            <w:tcMar>
+              <w:top w:type="dxa" w:w="40"/>
+              <w:left w:type="dxa" w:w="80"/>
+              <w:bottom w:type="dxa" w:w="40"/>
+              <w:right w:type="dxa" w:w="80"/>
+            </w:tcMar>
+          </w:tcPr>
+          <w:p>
+            <w:pPr>
+              <w:spacing w:after="0"/>
+            </w:pPr>
+            <w:r>
+              <w:rPr>
+                <w:rFonts w:ascii="Arial" w:cs="Arial" w:eastAsia="Arial" w:hAnsi="Arial"/>
+                <w:sz w:val="18"/>
+                <w:szCs w:val="18"/>
+              </w:rPr>
+              <w:t xml:space="preserve">Elegir una: SJG3.0-1.6 de 2,6 × 1,8 m (fabricante) o el equivalente de 2,5 × 1,3 m que hoy figura en la planilla</w:t>
+            </w:r>
+          </w:p>
+        </w:tc>
+        <w:tc>
+          <w:tcPr>
+            <w:tcW w:type="dxa" w:w="3038"/>
+            <w:tcBorders>
+              <w:top w:val="single" w:color="A6A6A6" w:sz="4"/>
+              <w:left w:val="single" w:color="A6A6A6" w:sz="4"/>
+              <w:bottom w:val="single" w:color="A6A6A6" w:sz="4"/>
+              <w:right w:val="single" w:color="A6A6A6" w:sz="4"/>
+            </w:tcBorders>
+            <w:tcMar>
+              <w:top w:type="dxa" w:w="40"/>
+              <w:left w:type="dxa" w:w="80"/>
+              <w:bottom w:type="dxa" w:w="40"/>
+              <w:right w:type="dxa" w:w="80"/>
+            </w:tcMar>
+          </w:tcPr>
+          <w:p>
+            <w:pPr>
+              <w:spacing w:after="0"/>
+            </w:pPr>
+            <w:r>
+              <w:rPr>
+                <w:rFonts w:ascii="Arial" w:cs="Arial" w:eastAsia="Arial" w:hAnsi="Arial"/>
+                <w:sz w:val="18"/>
+                <w:szCs w:val="18"/>
+              </w:rPr>
+              <w:t xml:space="preserve">Pulmones I6 · fabricante SJG · Workplace Products</w:t>
+            </w:r>
+          </w:p>
+        </w:tc>
+        <w:tc>
+          <w:tcPr>
+            <w:tcW w:type="dxa" w:w="1500"/>
             <w:tcBorders>
               <w:top w:val="single" w:color="A6A6A6" w:sz="4"/>
               <w:left w:val="single" w:color="A6A6A6" w:sz="4"/>
@@ -3362,11 +3362,11 @@
                 <w:rFonts w:ascii="Arial" w:cs="Arial" w:eastAsia="Arial" w:hAnsi="Arial"/>
                 <w:b/>
                 <w:bCs/>
-                <w:color w:val="C55A11"/>
-                <w:sz w:val="18"/>
-                <w:szCs w:val="18"/>
-              </w:rPr>
-              <w:t xml:space="preserve">Mal dimensionado</w:t>
+                <w:color w:val="1F4E79"/>
+                <w:sz w:val="18"/>
+                <w:szCs w:val="18"/>
+              </w:rPr>
+              <w:t xml:space="preserve">Discutir</w:t>
             </w:r>
           </w:p>
         </w:tc>
@@ -3398,103 +3398,103 @@
                 <w:sz w:val="18"/>
                 <w:szCs w:val="18"/>
               </w:rPr>
-              <w:t xml:space="preserve">Zona del tope trasero</w:t>
-            </w:r>
-          </w:p>
-        </w:tc>
-        <w:tc>
-          <w:tcPr>
-            <w:tcW w:type="dxa" w:w="2600"/>
-            <w:tcBorders>
-              <w:top w:val="single" w:color="A6A6A6" w:sz="4"/>
-              <w:left w:val="single" w:color="A6A6A6" w:sz="4"/>
-              <w:bottom w:val="single" w:color="A6A6A6" w:sz="4"/>
-              <w:right w:val="single" w:color="A6A6A6" w:sz="4"/>
-            </w:tcBorders>
-            <w:tcMar>
-              <w:top w:type="dxa" w:w="40"/>
-              <w:left w:type="dxa" w:w="80"/>
-              <w:bottom w:type="dxa" w:w="40"/>
-              <w:right w:type="dxa" w:w="80"/>
-            </w:tcMar>
-          </w:tcPr>
-          <w:p>
-            <w:pPr>
-              <w:spacing w:after="0"/>
-            </w:pPr>
-            <w:r>
-              <w:rPr>
-                <w:rFonts w:ascii="Arial" w:cs="Arial" w:eastAsia="Arial" w:hAnsi="Arial"/>
-                <w:sz w:val="18"/>
-                <w:szCs w:val="18"/>
-              </w:rPr>
-              <w:t xml:space="preserve">0,8 × 3,04 m</w:t>
-            </w:r>
-          </w:p>
-        </w:tc>
-        <w:tc>
-          <w:tcPr>
-            <w:tcW w:type="dxa" w:w="4300"/>
-            <w:tcBorders>
-              <w:top w:val="single" w:color="A6A6A6" w:sz="4"/>
-              <w:left w:val="single" w:color="A6A6A6" w:sz="4"/>
-              <w:bottom w:val="single" w:color="A6A6A6" w:sz="4"/>
-              <w:right w:val="single" w:color="A6A6A6" w:sz="4"/>
-            </w:tcBorders>
-            <w:tcMar>
-              <w:top w:type="dxa" w:w="40"/>
-              <w:left w:type="dxa" w:w="80"/>
-              <w:bottom w:type="dxa" w:w="40"/>
-              <w:right w:type="dxa" w:w="80"/>
-            </w:tcMar>
-          </w:tcPr>
-          <w:p>
-            <w:pPr>
-              <w:spacing w:after="0"/>
-            </w:pPr>
-            <w:r>
-              <w:rPr>
-                <w:rFonts w:ascii="Arial" w:cs="Arial" w:eastAsia="Arial" w:hAnsi="Arial"/>
-                <w:sz w:val="18"/>
-                <w:szCs w:val="18"/>
-              </w:rPr>
-              <w:t xml:space="preserve">Verificar el recorrido real del tope de la QC12Y: tiene que alcanzar la pieza más larga, 640 mm (cuerpo de 50 kg)</w:t>
-            </w:r>
-          </w:p>
-        </w:tc>
-        <w:tc>
-          <w:tcPr>
-            <w:tcW w:type="dxa" w:w="3438"/>
-            <w:tcBorders>
-              <w:top w:val="single" w:color="A6A6A6" w:sz="4"/>
-              <w:left w:val="single" w:color="A6A6A6" w:sz="4"/>
-              <w:bottom w:val="single" w:color="A6A6A6" w:sz="4"/>
-              <w:right w:val="single" w:color="A6A6A6" w:sz="4"/>
-            </w:tcBorders>
-            <w:tcMar>
-              <w:top w:type="dxa" w:w="40"/>
-              <w:left w:type="dxa" w:w="80"/>
-              <w:bottom w:type="dxa" w:w="40"/>
-              <w:right w:type="dxa" w:w="80"/>
-            </w:tcMar>
-          </w:tcPr>
-          <w:p>
-            <w:pPr>
-              <w:spacing w:after="0"/>
-            </w:pPr>
-            <w:r>
-              <w:rPr>
-                <w:rFonts w:ascii="Arial" w:cs="Arial" w:eastAsia="Arial" w:hAnsi="Arial"/>
-                <w:sz w:val="18"/>
-                <w:szCs w:val="18"/>
-              </w:rPr>
-              <w:t xml:space="preserve">Plano · Word Carros › tabla de corte</w:t>
-            </w:r>
-          </w:p>
-        </w:tc>
-        <w:tc>
-          <w:tcPr>
-            <w:tcW w:type="dxa" w:w="1600"/>
+              <w:t xml:space="preserve">Zona detrás de la cuchilla (tope trasero)</w:t>
+            </w:r>
+          </w:p>
+        </w:tc>
+        <w:tc>
+          <w:tcPr>
+            <w:tcW w:type="dxa" w:w="3300"/>
+            <w:tcBorders>
+              <w:top w:val="single" w:color="A6A6A6" w:sz="4"/>
+              <w:left w:val="single" w:color="A6A6A6" w:sz="4"/>
+              <w:bottom w:val="single" w:color="A6A6A6" w:sz="4"/>
+              <w:right w:val="single" w:color="A6A6A6" w:sz="4"/>
+            </w:tcBorders>
+            <w:tcMar>
+              <w:top w:type="dxa" w:w="40"/>
+              <w:left w:type="dxa" w:w="80"/>
+              <w:bottom w:type="dxa" w:w="40"/>
+              <w:right w:type="dxa" w:w="80"/>
+            </w:tcMar>
+          </w:tcPr>
+          <w:p>
+            <w:pPr>
+              <w:spacing w:after="0"/>
+            </w:pPr>
+            <w:r>
+              <w:rPr>
+                <w:rFonts w:ascii="Arial" w:cs="Arial" w:eastAsia="Arial" w:hAnsi="Arial"/>
+                <w:sz w:val="18"/>
+                <w:szCs w:val="18"/>
+              </w:rPr>
+              <w:t xml:space="preserve">Ahí caen las piezas</w:t>
+            </w:r>
+          </w:p>
+        </w:tc>
+        <w:tc>
+          <w:tcPr>
+            <w:tcW w:type="dxa" w:w="4100"/>
+            <w:tcBorders>
+              <w:top w:val="single" w:color="A6A6A6" w:sz="4"/>
+              <w:left w:val="single" w:color="A6A6A6" w:sz="4"/>
+              <w:bottom w:val="single" w:color="A6A6A6" w:sz="4"/>
+              <w:right w:val="single" w:color="A6A6A6" w:sz="4"/>
+            </w:tcBorders>
+            <w:tcMar>
+              <w:top w:type="dxa" w:w="40"/>
+              <w:left w:type="dxa" w:w="80"/>
+              <w:bottom w:type="dxa" w:w="40"/>
+              <w:right w:type="dxa" w:w="80"/>
+            </w:tcMar>
+          </w:tcPr>
+          <w:p>
+            <w:pPr>
+              <w:spacing w:after="0"/>
+            </w:pPr>
+            <w:r>
+              <w:rPr>
+                <w:rFonts w:ascii="Arial" w:cs="Arial" w:eastAsia="Arial" w:hAnsi="Arial"/>
+                <w:sz w:val="18"/>
+                <w:szCs w:val="18"/>
+              </w:rPr>
+              <w:t xml:space="preserve">3,10 m × recorrido del tope de la QC12Y. El tope tiene que llegar a 640 mm (cuerpo de 50 kg)</w:t>
+            </w:r>
+          </w:p>
+        </w:tc>
+        <w:tc>
+          <w:tcPr>
+            <w:tcW w:type="dxa" w:w="3038"/>
+            <w:tcBorders>
+              <w:top w:val="single" w:color="A6A6A6" w:sz="4"/>
+              <w:left w:val="single" w:color="A6A6A6" w:sz="4"/>
+              <w:bottom w:val="single" w:color="A6A6A6" w:sz="4"/>
+              <w:right w:val="single" w:color="A6A6A6" w:sz="4"/>
+            </w:tcBorders>
+            <w:tcMar>
+              <w:top w:type="dxa" w:w="40"/>
+              <w:left w:type="dxa" w:w="80"/>
+              <w:bottom w:type="dxa" w:w="40"/>
+              <w:right w:type="dxa" w:w="80"/>
+            </w:tcMar>
+          </w:tcPr>
+          <w:p>
+            <w:pPr>
+              <w:spacing w:after="0"/>
+            </w:pPr>
+            <w:r>
+              <w:rPr>
+                <w:rFonts w:ascii="Arial" w:cs="Arial" w:eastAsia="Arial" w:hAnsi="Arial"/>
+                <w:sz w:val="18"/>
+                <w:szCs w:val="18"/>
+              </w:rPr>
+              <w:t xml:space="preserve">Recorrido sin fuente</w:t>
+            </w:r>
+          </w:p>
+        </w:tc>
+        <w:tc>
+          <w:tcPr>
+            <w:tcW w:type="dxa" w:w="1500"/>
             <w:tcBorders>
               <w:top w:val="single" w:color="A6A6A6" w:sz="4"/>
               <w:left w:val="single" w:color="A6A6A6" w:sz="4"/>
@@ -3553,103 +3553,103 @@
                 <w:sz w:val="18"/>
                 <w:szCs w:val="18"/>
               </w:rPr>
-              <w:t xml:space="preserve">Salida de piezas detrás de la G2</w:t>
-            </w:r>
-          </w:p>
-        </w:tc>
-        <w:tc>
-          <w:tcPr>
-            <w:tcW w:type="dxa" w:w="2600"/>
-            <w:tcBorders>
-              <w:top w:val="single" w:color="A6A6A6" w:sz="4"/>
-              <w:left w:val="single" w:color="A6A6A6" w:sz="4"/>
-              <w:bottom w:val="single" w:color="A6A6A6" w:sz="4"/>
-              <w:right w:val="single" w:color="A6A6A6" w:sz="4"/>
-            </w:tcBorders>
-            <w:tcMar>
-              <w:top w:type="dxa" w:w="40"/>
-              <w:left w:type="dxa" w:w="80"/>
-              <w:bottom w:type="dxa" w:w="40"/>
-              <w:right w:type="dxa" w:w="80"/>
-            </w:tcMar>
-          </w:tcPr>
-          <w:p>
-            <w:pPr>
-              <w:spacing w:after="0"/>
-            </w:pPr>
-            <w:r>
-              <w:rPr>
-                <w:rFonts w:ascii="Arial" w:cs="Arial" w:eastAsia="Arial" w:hAnsi="Arial"/>
-                <w:sz w:val="18"/>
-                <w:szCs w:val="18"/>
-              </w:rPr>
-              <w:t xml:space="preserve">No hay rampa: los carros están detrás de la zona del tope</w:t>
-            </w:r>
-          </w:p>
-        </w:tc>
-        <w:tc>
-          <w:tcPr>
-            <w:tcW w:type="dxa" w:w="4300"/>
-            <w:tcBorders>
-              <w:top w:val="single" w:color="A6A6A6" w:sz="4"/>
-              <w:left w:val="single" w:color="A6A6A6" w:sz="4"/>
-              <w:bottom w:val="single" w:color="A6A6A6" w:sz="4"/>
-              <w:right w:val="single" w:color="A6A6A6" w:sz="4"/>
-            </w:tcBorders>
-            <w:tcMar>
-              <w:top w:type="dxa" w:w="40"/>
-              <w:left w:type="dxa" w:w="80"/>
-              <w:bottom w:type="dxa" w:w="40"/>
-              <w:right w:type="dxa" w:w="80"/>
-            </w:tcMar>
-          </w:tcPr>
-          <w:p>
-            <w:pPr>
-              <w:spacing w:after="0"/>
-            </w:pPr>
-            <w:r>
-              <w:rPr>
-                <w:rFonts w:ascii="Arial" w:cs="Arial" w:eastAsia="Arial" w:hAnsi="Arial"/>
-                <w:sz w:val="18"/>
-                <w:szCs w:val="18"/>
-              </w:rPr>
-              <w:t xml:space="preserve">Rampa o mesa de recepción detrás de la cuchilla para que la pieza llegue al carro sin entrar a la zona cerrada</w:t>
-            </w:r>
-          </w:p>
-        </w:tc>
-        <w:tc>
-          <w:tcPr>
-            <w:tcW w:type="dxa" w:w="3438"/>
-            <w:tcBorders>
-              <w:top w:val="single" w:color="A6A6A6" w:sz="4"/>
-              <w:left w:val="single" w:color="A6A6A6" w:sz="4"/>
-              <w:bottom w:val="single" w:color="A6A6A6" w:sz="4"/>
-              <w:right w:val="single" w:color="A6A6A6" w:sz="4"/>
-            </w:tcBorders>
-            <w:tcMar>
-              <w:top w:type="dxa" w:w="40"/>
-              <w:left w:type="dxa" w:w="80"/>
-              <w:bottom w:type="dxa" w:w="40"/>
-              <w:right w:type="dxa" w:w="80"/>
-            </w:tcMar>
-          </w:tcPr>
-          <w:p>
-            <w:pPr>
-              <w:spacing w:after="0"/>
-            </w:pPr>
-            <w:r>
-              <w:rPr>
-                <w:rFonts w:ascii="Arial" w:cs="Arial" w:eastAsia="Arial" w:hAnsi="Arial"/>
-                <w:sz w:val="18"/>
-                <w:szCs w:val="18"/>
-              </w:rPr>
-              <w:t xml:space="preserve">Word Carros › Salida (rampa trasera)</w:t>
-            </w:r>
-          </w:p>
-        </w:tc>
-        <w:tc>
-          <w:tcPr>
-            <w:tcW w:type="dxa" w:w="1600"/>
+              <w:t xml:space="preserve">Rampa o mesa de salida de piezas</w:t>
+            </w:r>
+          </w:p>
+        </w:tc>
+        <w:tc>
+          <w:tcPr>
+            <w:tcW w:type="dxa" w:w="3300"/>
+            <w:tcBorders>
+              <w:top w:val="single" w:color="A6A6A6" w:sz="4"/>
+              <w:left w:val="single" w:color="A6A6A6" w:sz="4"/>
+              <w:bottom w:val="single" w:color="A6A6A6" w:sz="4"/>
+              <w:right w:val="single" w:color="A6A6A6" w:sz="4"/>
+            </w:tcBorders>
+            <w:tcMar>
+              <w:top w:type="dxa" w:w="40"/>
+              <w:left w:type="dxa" w:w="80"/>
+              <w:bottom w:type="dxa" w:w="40"/>
+              <w:right w:type="dxa" w:w="80"/>
+            </w:tcMar>
+          </w:tcPr>
+          <w:p>
+            <w:pPr>
+              <w:spacing w:after="0"/>
+            </w:pPr>
+            <w:r>
+              <w:rPr>
+                <w:rFonts w:ascii="Arial" w:cs="Arial" w:eastAsia="Arial" w:hAnsi="Arial"/>
+                <w:sz w:val="18"/>
+                <w:szCs w:val="18"/>
+              </w:rPr>
+              <w:t xml:space="preserve">Las piezas caen detrás de la cuchilla, en la zona cerrada</w:t>
+            </w:r>
+          </w:p>
+        </w:tc>
+        <w:tc>
+          <w:tcPr>
+            <w:tcW w:type="dxa" w:w="4100"/>
+            <w:tcBorders>
+              <w:top w:val="single" w:color="A6A6A6" w:sz="4"/>
+              <w:left w:val="single" w:color="A6A6A6" w:sz="4"/>
+              <w:bottom w:val="single" w:color="A6A6A6" w:sz="4"/>
+              <w:right w:val="single" w:color="A6A6A6" w:sz="4"/>
+            </w:tcBorders>
+            <w:tcMar>
+              <w:top w:type="dxa" w:w="40"/>
+              <w:left w:type="dxa" w:w="80"/>
+              <w:bottom w:type="dxa" w:w="40"/>
+              <w:right w:type="dxa" w:w="80"/>
+            </w:tcMar>
+          </w:tcPr>
+          <w:p>
+            <w:pPr>
+              <w:spacing w:after="0"/>
+            </w:pPr>
+            <w:r>
+              <w:rPr>
+                <w:rFonts w:ascii="Arial" w:cs="Arial" w:eastAsia="Arial" w:hAnsi="Arial"/>
+                <w:sz w:val="18"/>
+                <w:szCs w:val="18"/>
+              </w:rPr>
+              <w:t xml:space="preserve">Rampa detrás de la cuchilla que lleve la pieza al carro sin entrar a la zona cerrada</w:t>
+            </w:r>
+          </w:p>
+        </w:tc>
+        <w:tc>
+          <w:tcPr>
+            <w:tcW w:type="dxa" w:w="3038"/>
+            <w:tcBorders>
+              <w:top w:val="single" w:color="A6A6A6" w:sz="4"/>
+              <w:left w:val="single" w:color="A6A6A6" w:sz="4"/>
+              <w:bottom w:val="single" w:color="A6A6A6" w:sz="4"/>
+              <w:right w:val="single" w:color="A6A6A6" w:sz="4"/>
+            </w:tcBorders>
+            <w:tcMar>
+              <w:top w:type="dxa" w:w="40"/>
+              <w:left w:type="dxa" w:w="80"/>
+              <w:bottom w:type="dxa" w:w="40"/>
+              <w:right w:type="dxa" w:w="80"/>
+            </w:tcMar>
+          </w:tcPr>
+          <w:p>
+            <w:pPr>
+              <w:spacing w:after="0"/>
+            </w:pPr>
+            <w:r>
+              <w:rPr>
+                <w:rFonts w:ascii="Arial" w:cs="Arial" w:eastAsia="Arial" w:hAnsi="Arial"/>
+                <w:sz w:val="18"/>
+                <w:szCs w:val="18"/>
+              </w:rPr>
+              <w:t xml:space="preserve">Medida sin fuente</w:t>
+            </w:r>
+          </w:p>
+        </w:tc>
+        <w:tc>
+          <w:tcPr>
+            <w:tcW w:type="dxa" w:w="1500"/>
             <w:tcBorders>
               <w:top w:val="single" w:color="A6A6A6" w:sz="4"/>
               <w:left w:val="single" w:color="A6A6A6" w:sz="4"/>
@@ -3708,103 +3708,103 @@
                 <w:sz w:val="18"/>
                 <w:szCs w:val="18"/>
               </w:rPr>
-              <w:t xml:space="preserve">Carros FCEP10520 (desarrollos de manuales y piezas de carros)</w:t>
-            </w:r>
-          </w:p>
-        </w:tc>
-        <w:tc>
-          <w:tcPr>
-            <w:tcW w:type="dxa" w:w="2600"/>
-            <w:tcBorders>
-              <w:top w:val="single" w:color="A6A6A6" w:sz="4"/>
-              <w:left w:val="single" w:color="A6A6A6" w:sz="4"/>
-              <w:bottom w:val="single" w:color="A6A6A6" w:sz="4"/>
-              <w:right w:val="single" w:color="A6A6A6" w:sz="4"/>
-            </w:tcBorders>
-            <w:tcMar>
-              <w:top w:type="dxa" w:w="40"/>
-              <w:left w:type="dxa" w:w="80"/>
-              <w:bottom w:type="dxa" w:w="40"/>
-              <w:right w:type="dxa" w:w="80"/>
-            </w:tcMar>
-          </w:tcPr>
-          <w:p>
-            <w:pPr>
-              <w:spacing w:after="0"/>
-            </w:pPr>
-            <w:r>
-              <w:rPr>
-                <w:rFonts w:ascii="Arial" w:cs="Arial" w:eastAsia="Arial" w:hAnsi="Arial"/>
-                <w:sz w:val="18"/>
-                <w:szCs w:val="18"/>
-              </w:rPr>
-              <w:t xml:space="preserve">2 carros de 0,7 × 1,09 m</w:t>
-            </w:r>
-          </w:p>
-        </w:tc>
-        <w:tc>
-          <w:tcPr>
-            <w:tcW w:type="dxa" w:w="4300"/>
-            <w:tcBorders>
-              <w:top w:val="single" w:color="A6A6A6" w:sz="4"/>
-              <w:left w:val="single" w:color="A6A6A6" w:sz="4"/>
-              <w:bottom w:val="single" w:color="A6A6A6" w:sz="4"/>
-              <w:right w:val="single" w:color="A6A6A6" w:sz="4"/>
-            </w:tcBorders>
-            <w:tcMar>
-              <w:top w:type="dxa" w:w="40"/>
-              <w:left w:type="dxa" w:w="80"/>
-              <w:bottom w:type="dxa" w:w="40"/>
-              <w:right w:type="dxa" w:w="80"/>
-            </w:tcMar>
-          </w:tcPr>
-          <w:p>
-            <w:pPr>
-              <w:spacing w:after="0"/>
-            </w:pPr>
-            <w:r>
-              <w:rPr>
-                <w:rFonts w:ascii="Arial" w:cs="Arial" w:eastAsia="Arial" w:hAnsi="Arial"/>
-                <w:sz w:val="18"/>
-                <w:szCs w:val="18"/>
-              </w:rPr>
-              <w:t xml:space="preserve">En la planilla figura 1 carro de 1,3 × 0,7 m (dato de Fran con maniobra). Definir si son 1 o 2 y con qué medida</w:t>
-            </w:r>
-          </w:p>
-        </w:tc>
-        <w:tc>
-          <w:tcPr>
-            <w:tcW w:type="dxa" w:w="3438"/>
-            <w:tcBorders>
-              <w:top w:val="single" w:color="A6A6A6" w:sz="4"/>
-              <w:left w:val="single" w:color="A6A6A6" w:sz="4"/>
-              <w:bottom w:val="single" w:color="A6A6A6" w:sz="4"/>
-              <w:right w:val="single" w:color="A6A6A6" w:sz="4"/>
-            </w:tcBorders>
-            <w:tcMar>
-              <w:top w:type="dxa" w:w="40"/>
-              <w:left w:type="dxa" w:w="80"/>
-              <w:bottom w:type="dxa" w:w="40"/>
-              <w:right w:type="dxa" w:w="80"/>
-            </w:tcMar>
-          </w:tcPr>
-          <w:p>
-            <w:pPr>
-              <w:spacing w:after="0"/>
-            </w:pPr>
-            <w:r>
-              <w:rPr>
-                <w:rFonts w:ascii="Arial" w:cs="Arial" w:eastAsia="Arial" w:hAnsi="Arial"/>
-                <w:sz w:val="18"/>
-                <w:szCs w:val="18"/>
-              </w:rPr>
-              <w:t xml:space="preserve">Plano · Storage Compat · Pulmones D42</w:t>
-            </w:r>
-          </w:p>
-        </w:tc>
-        <w:tc>
-          <w:tcPr>
-            <w:tcW w:type="dxa" w:w="1600"/>
+              <w:t xml:space="preserve">Carros de desarrollos de manuales y de piezas de carros</w:t>
+            </w:r>
+          </w:p>
+        </w:tc>
+        <w:tc>
+          <w:tcPr>
+            <w:tcW w:type="dxa" w:w="3300"/>
+            <w:tcBorders>
+              <w:top w:val="single" w:color="A6A6A6" w:sz="4"/>
+              <w:left w:val="single" w:color="A6A6A6" w:sz="4"/>
+              <w:bottom w:val="single" w:color="A6A6A6" w:sz="4"/>
+              <w:right w:val="single" w:color="A6A6A6" w:sz="4"/>
+            </w:tcBorders>
+            <w:tcMar>
+              <w:top w:type="dxa" w:w="40"/>
+              <w:left w:type="dxa" w:w="80"/>
+              <w:bottom w:type="dxa" w:w="40"/>
+              <w:right w:type="dxa" w:w="80"/>
+            </w:tcMar>
+          </w:tcPr>
+          <w:p>
+            <w:pPr>
+              <w:spacing w:after="0"/>
+            </w:pPr>
+            <w:r>
+              <w:rPr>
+                <w:rFonts w:ascii="Arial" w:cs="Arial" w:eastAsia="Arial" w:hAnsi="Arial"/>
+                <w:sz w:val="18"/>
+                <w:szCs w:val="18"/>
+              </w:rPr>
+              <w:t xml:space="preserve">Llevar las piezas al marcado</w:t>
+            </w:r>
+          </w:p>
+        </w:tc>
+        <w:tc>
+          <w:tcPr>
+            <w:tcW w:type="dxa" w:w="4100"/>
+            <w:tcBorders>
+              <w:top w:val="single" w:color="A6A6A6" w:sz="4"/>
+              <w:left w:val="single" w:color="A6A6A6" w:sz="4"/>
+              <w:bottom w:val="single" w:color="A6A6A6" w:sz="4"/>
+              <w:right w:val="single" w:color="A6A6A6" w:sz="4"/>
+            </w:tcBorders>
+            <w:tcMar>
+              <w:top w:type="dxa" w:w="40"/>
+              <w:left w:type="dxa" w:w="80"/>
+              <w:bottom w:type="dxa" w:w="40"/>
+              <w:right w:type="dxa" w:w="80"/>
+            </w:tcMar>
+          </w:tcPr>
+          <w:p>
+            <w:pPr>
+              <w:spacing w:after="0"/>
+            </w:pPr>
+            <w:r>
+              <w:rPr>
+                <w:rFonts w:ascii="Arial" w:cs="Arial" w:eastAsia="Arial" w:hAnsi="Arial"/>
+                <w:sz w:val="18"/>
+                <w:szCs w:val="18"/>
+              </w:rPr>
+              <w:t xml:space="preserve">Definir si son 1 o 2 y con qué medida: carro FCEP10520 de 1,065 × 0,70 m o el de Fran de 1,3 × 0,7 m (con maniobra)</w:t>
+            </w:r>
+          </w:p>
+        </w:tc>
+        <w:tc>
+          <w:tcPr>
+            <w:tcW w:type="dxa" w:w="3038"/>
+            <w:tcBorders>
+              <w:top w:val="single" w:color="A6A6A6" w:sz="4"/>
+              <w:left w:val="single" w:color="A6A6A6" w:sz="4"/>
+              <w:bottom w:val="single" w:color="A6A6A6" w:sz="4"/>
+              <w:right w:val="single" w:color="A6A6A6" w:sz="4"/>
+            </w:tcBorders>
+            <w:tcMar>
+              <w:top w:type="dxa" w:w="40"/>
+              <w:left w:type="dxa" w:w="80"/>
+              <w:bottom w:type="dxa" w:w="40"/>
+              <w:right w:type="dxa" w:w="80"/>
+            </w:tcMar>
+          </w:tcPr>
+          <w:p>
+            <w:pPr>
+              <w:spacing w:after="0"/>
+            </w:pPr>
+            <w:r>
+              <w:rPr>
+                <w:rFonts w:ascii="Arial" w:cs="Arial" w:eastAsia="Arial" w:hAnsi="Arial"/>
+                <w:sz w:val="18"/>
+                <w:szCs w:val="18"/>
+              </w:rPr>
+              <w:t xml:space="preserve">Storage Compat · Pulmones D42</w:t>
+            </w:r>
+          </w:p>
+        </w:tc>
+        <w:tc>
+          <w:tcPr>
+            <w:tcW w:type="dxa" w:w="1500"/>
             <w:tcBorders>
               <w:top w:val="single" w:color="A6A6A6" w:sz="4"/>
               <w:left w:val="single" w:color="A6A6A6" w:sz="4"/>
@@ -3869,97 +3869,97 @@
         </w:tc>
         <w:tc>
           <w:tcPr>
-            <w:tcW w:type="dxa" w:w="2600"/>
-            <w:tcBorders>
-              <w:top w:val="single" w:color="A6A6A6" w:sz="4"/>
-              <w:left w:val="single" w:color="A6A6A6" w:sz="4"/>
-              <w:bottom w:val="single" w:color="A6A6A6" w:sz="4"/>
-              <w:right w:val="single" w:color="A6A6A6" w:sz="4"/>
-            </w:tcBorders>
-            <w:tcMar>
-              <w:top w:type="dxa" w:w="40"/>
-              <w:left w:type="dxa" w:w="80"/>
-              <w:bottom w:type="dxa" w:w="40"/>
-              <w:right w:type="dxa" w:w="80"/>
-            </w:tcMar>
-          </w:tcPr>
-          <w:p>
-            <w:pPr>
-              <w:spacing w:after="0"/>
-            </w:pPr>
-            <w:r>
-              <w:rPr>
-                <w:rFonts w:ascii="Arial" w:cs="Arial" w:eastAsia="Arial" w:hAnsi="Arial"/>
-                <w:sz w:val="18"/>
-                <w:szCs w:val="18"/>
-              </w:rPr>
-              <w:t xml:space="preserve">0,7 × 1,09 m, compartido con la G1</w:t>
-            </w:r>
-          </w:p>
-        </w:tc>
-        <w:tc>
-          <w:tcPr>
-            <w:tcW w:type="dxa" w:w="4300"/>
-            <w:tcBorders>
-              <w:top w:val="single" w:color="A6A6A6" w:sz="4"/>
-              <w:left w:val="single" w:color="A6A6A6" w:sz="4"/>
-              <w:bottom w:val="single" w:color="A6A6A6" w:sz="4"/>
-              <w:right w:val="single" w:color="A6A6A6" w:sz="4"/>
-            </w:tcBorders>
-            <w:tcMar>
-              <w:top w:type="dxa" w:w="40"/>
-              <w:left w:type="dxa" w:w="80"/>
-              <w:bottom w:type="dxa" w:w="40"/>
-              <w:right w:type="dxa" w:w="80"/>
-            </w:tcMar>
-          </w:tcPr>
-          <w:p>
-            <w:pPr>
-              <w:spacing w:after="0"/>
-            </w:pPr>
-            <w:r>
-              <w:rPr>
-                <w:rFonts w:ascii="Arial" w:cs="Arial" w:eastAsia="Arial" w:hAnsi="Arial"/>
-                <w:sz w:val="18"/>
-                <w:szCs w:val="18"/>
-              </w:rPr>
-              <w:t xml:space="preserve">Queda solo para la G2 (la G1 tiene el suyo)</w:t>
-            </w:r>
-          </w:p>
-        </w:tc>
-        <w:tc>
-          <w:tcPr>
-            <w:tcW w:type="dxa" w:w="3438"/>
-            <w:tcBorders>
-              <w:top w:val="single" w:color="A6A6A6" w:sz="4"/>
-              <w:left w:val="single" w:color="A6A6A6" w:sz="4"/>
-              <w:bottom w:val="single" w:color="A6A6A6" w:sz="4"/>
-              <w:right w:val="single" w:color="A6A6A6" w:sz="4"/>
-            </w:tcBorders>
-            <w:tcMar>
-              <w:top w:type="dxa" w:w="40"/>
-              <w:left w:type="dxa" w:w="80"/>
-              <w:bottom w:type="dxa" w:w="40"/>
-              <w:right w:type="dxa" w:w="80"/>
-            </w:tcMar>
-          </w:tcPr>
-          <w:p>
-            <w:pPr>
-              <w:spacing w:after="0"/>
-            </w:pPr>
-            <w:r>
-              <w:rPr>
-                <w:rFonts w:ascii="Arial" w:cs="Arial" w:eastAsia="Arial" w:hAnsi="Arial"/>
-                <w:sz w:val="18"/>
-                <w:szCs w:val="18"/>
-              </w:rPr>
-              <w:t xml:space="preserve">Plano rev23</w:t>
-            </w:r>
-          </w:p>
-        </w:tc>
-        <w:tc>
-          <w:tcPr>
-            <w:tcW w:type="dxa" w:w="1600"/>
+            <w:tcW w:type="dxa" w:w="3300"/>
+            <w:tcBorders>
+              <w:top w:val="single" w:color="A6A6A6" w:sz="4"/>
+              <w:left w:val="single" w:color="A6A6A6" w:sz="4"/>
+              <w:bottom w:val="single" w:color="A6A6A6" w:sz="4"/>
+              <w:right w:val="single" w:color="A6A6A6" w:sz="4"/>
+            </w:tcBorders>
+            <w:tcMar>
+              <w:top w:type="dxa" w:w="40"/>
+              <w:left w:type="dxa" w:w="80"/>
+              <w:bottom w:type="dxa" w:w="40"/>
+              <w:right w:type="dxa" w:w="80"/>
+            </w:tcMar>
+          </w:tcPr>
+          <w:p>
+            <w:pPr>
+              <w:spacing w:after="0"/>
+            </w:pPr>
+            <w:r>
+              <w:rPr>
+                <w:rFonts w:ascii="Arial" w:cs="Arial" w:eastAsia="Arial" w:hAnsi="Arial"/>
+                <w:sz w:val="18"/>
+                <w:szCs w:val="18"/>
+              </w:rPr>
+              <w:t xml:space="preserve">Orillas de la franja</w:t>
+            </w:r>
+          </w:p>
+        </w:tc>
+        <w:tc>
+          <w:tcPr>
+            <w:tcW w:type="dxa" w:w="4100"/>
+            <w:tcBorders>
+              <w:top w:val="single" w:color="A6A6A6" w:sz="4"/>
+              <w:left w:val="single" w:color="A6A6A6" w:sz="4"/>
+              <w:bottom w:val="single" w:color="A6A6A6" w:sz="4"/>
+              <w:right w:val="single" w:color="A6A6A6" w:sz="4"/>
+            </w:tcBorders>
+            <w:tcMar>
+              <w:top w:type="dxa" w:w="40"/>
+              <w:left w:type="dxa" w:w="80"/>
+              <w:bottom w:type="dxa" w:w="40"/>
+              <w:right w:type="dxa" w:w="80"/>
+            </w:tcMar>
+          </w:tcPr>
+          <w:p>
+            <w:pPr>
+              <w:spacing w:after="0"/>
+            </w:pPr>
+            <w:r>
+              <w:rPr>
+                <w:rFonts w:ascii="Arial" w:cs="Arial" w:eastAsia="Arial" w:hAnsi="Arial"/>
+                <w:sz w:val="18"/>
+                <w:szCs w:val="18"/>
+              </w:rPr>
+              <w:t xml:space="preserve">Carro al costado de la G2, del lado del operario</w:t>
+            </w:r>
+          </w:p>
+        </w:tc>
+        <w:tc>
+          <w:tcPr>
+            <w:tcW w:type="dxa" w:w="3038"/>
+            <w:tcBorders>
+              <w:top w:val="single" w:color="A6A6A6" w:sz="4"/>
+              <w:left w:val="single" w:color="A6A6A6" w:sz="4"/>
+              <w:bottom w:val="single" w:color="A6A6A6" w:sz="4"/>
+              <w:right w:val="single" w:color="A6A6A6" w:sz="4"/>
+            </w:tcBorders>
+            <w:tcMar>
+              <w:top w:type="dxa" w:w="40"/>
+              <w:left w:type="dxa" w:w="80"/>
+              <w:bottom w:type="dxa" w:w="40"/>
+              <w:right w:type="dxa" w:w="80"/>
+            </w:tcMar>
+          </w:tcPr>
+          <w:p>
+            <w:pPr>
+              <w:spacing w:after="0"/>
+            </w:pPr>
+            <w:r>
+              <w:rPr>
+                <w:rFonts w:ascii="Arial" w:cs="Arial" w:eastAsia="Arial" w:hAnsi="Arial"/>
+                <w:sz w:val="18"/>
+                <w:szCs w:val="18"/>
+              </w:rPr>
+              <w:t xml:space="preserve">Medida sin fuente</w:t>
+            </w:r>
+          </w:p>
+        </w:tc>
+        <w:tc>
+          <w:tcPr>
+            <w:tcW w:type="dxa" w:w="1500"/>
             <w:tcBorders>
               <w:top w:val="single" w:color="A6A6A6" w:sz="4"/>
               <w:left w:val="single" w:color="A6A6A6" w:sz="4"/>
@@ -3982,11 +3982,11 @@
                 <w:rFonts w:ascii="Arial" w:cs="Arial" w:eastAsia="Arial" w:hAnsi="Arial"/>
                 <w:b/>
                 <w:bCs/>
-                <w:color w:val="375623"/>
-                <w:sz w:val="18"/>
-                <w:szCs w:val="18"/>
-              </w:rPr>
-              <w:t xml:space="preserve">OK</w:t>
+                <w:color w:val="7F6000"/>
+                <w:sz w:val="18"/>
+                <w:szCs w:val="18"/>
+              </w:rPr>
+              <w:t xml:space="preserve">A confirmar</w:t>
             </w:r>
           </w:p>
         </w:tc>
@@ -4024,67 +4024,67 @@
         </w:tc>
         <w:tc>
           <w:tcPr>
-            <w:tcW w:type="dxa" w:w="2600"/>
-            <w:tcBorders>
-              <w:top w:val="single" w:color="A6A6A6" w:sz="4"/>
-              <w:left w:val="single" w:color="A6A6A6" w:sz="4"/>
-              <w:bottom w:val="single" w:color="A6A6A6" w:sz="4"/>
-              <w:right w:val="single" w:color="A6A6A6" w:sz="4"/>
-            </w:tcBorders>
-            <w:tcMar>
-              <w:top w:type="dxa" w:w="40"/>
-              <w:left w:type="dxa" w:w="80"/>
-              <w:bottom w:type="dxa" w:w="40"/>
-              <w:right w:type="dxa" w:w="80"/>
-            </w:tcMar>
-          </w:tcPr>
-          <w:p>
-            <w:pPr>
-              <w:spacing w:after="0"/>
-            </w:pPr>
-            <w:r>
-              <w:rPr>
-                <w:rFonts w:ascii="Arial" w:cs="Arial" w:eastAsia="Arial" w:hAnsi="Arial"/>
-                <w:sz w:val="18"/>
-                <w:szCs w:val="18"/>
-              </w:rPr>
-              <w:t xml:space="preserve">No figuran</w:t>
-            </w:r>
-          </w:p>
-        </w:tc>
-        <w:tc>
-          <w:tcPr>
-            <w:tcW w:type="dxa" w:w="4300"/>
-            <w:tcBorders>
-              <w:top w:val="single" w:color="A6A6A6" w:sz="4"/>
-              <w:left w:val="single" w:color="A6A6A6" w:sz="4"/>
-              <w:bottom w:val="single" w:color="A6A6A6" w:sz="4"/>
-              <w:right w:val="single" w:color="A6A6A6" w:sz="4"/>
-            </w:tcBorders>
-            <w:tcMar>
-              <w:top w:type="dxa" w:w="40"/>
-              <w:left w:type="dxa" w:w="80"/>
-              <w:bottom w:type="dxa" w:w="40"/>
-              <w:right w:type="dxa" w:w="80"/>
-            </w:tcMar>
-          </w:tcPr>
-          <w:p>
-            <w:pPr>
-              <w:spacing w:after="0"/>
-            </w:pPr>
-            <w:r>
-              <w:rPr>
-                <w:rFonts w:ascii="Arial" w:cs="Arial" w:eastAsia="Arial" w:hAnsi="Arial"/>
-                <w:sz w:val="18"/>
-                <w:szCs w:val="18"/>
-              </w:rPr>
-              <w:t xml:space="preserve">Igual que en la G1: pedirlos en la compra y cerrar la zona trasera</w:t>
-            </w:r>
-          </w:p>
-        </w:tc>
-        <w:tc>
-          <w:tcPr>
-            <w:tcW w:type="dxa" w:w="3438"/>
+            <w:tcW w:type="dxa" w:w="3300"/>
+            <w:tcBorders>
+              <w:top w:val="single" w:color="A6A6A6" w:sz="4"/>
+              <w:left w:val="single" w:color="A6A6A6" w:sz="4"/>
+              <w:bottom w:val="single" w:color="A6A6A6" w:sz="4"/>
+              <w:right w:val="single" w:color="A6A6A6" w:sz="4"/>
+            </w:tcBorders>
+            <w:tcMar>
+              <w:top w:type="dxa" w:w="40"/>
+              <w:left w:type="dxa" w:w="80"/>
+              <w:bottom w:type="dxa" w:w="40"/>
+              <w:right w:type="dxa" w:w="80"/>
+            </w:tcMar>
+          </w:tcPr>
+          <w:p>
+            <w:pPr>
+              <w:spacing w:after="0"/>
+            </w:pPr>
+            <w:r>
+              <w:rPr>
+                <w:rFonts w:ascii="Arial" w:cs="Arial" w:eastAsia="Arial" w:hAnsi="Arial"/>
+                <w:sz w:val="18"/>
+                <w:szCs w:val="18"/>
+              </w:rPr>
+              <w:t xml:space="preserve">Igual que en la G1</w:t>
+            </w:r>
+          </w:p>
+        </w:tc>
+        <w:tc>
+          <w:tcPr>
+            <w:tcW w:type="dxa" w:w="4100"/>
+            <w:tcBorders>
+              <w:top w:val="single" w:color="A6A6A6" w:sz="4"/>
+              <w:left w:val="single" w:color="A6A6A6" w:sz="4"/>
+              <w:bottom w:val="single" w:color="A6A6A6" w:sz="4"/>
+              <w:right w:val="single" w:color="A6A6A6" w:sz="4"/>
+            </w:tcBorders>
+            <w:tcMar>
+              <w:top w:type="dxa" w:w="40"/>
+              <w:left w:type="dxa" w:w="80"/>
+              <w:bottom w:type="dxa" w:w="40"/>
+              <w:right w:type="dxa" w:w="80"/>
+            </w:tcMar>
+          </w:tcPr>
+          <w:p>
+            <w:pPr>
+              <w:spacing w:after="0"/>
+            </w:pPr>
+            <w:r>
+              <w:rPr>
+                <w:rFonts w:ascii="Arial" w:cs="Arial" w:eastAsia="Arial" w:hAnsi="Arial"/>
+                <w:sz w:val="18"/>
+                <w:szCs w:val="18"/>
+              </w:rPr>
+              <w:t xml:space="preserve">Pedirlos en la compra y cerrar la zona trasera</w:t>
+            </w:r>
+          </w:p>
+        </w:tc>
+        <w:tc>
+          <w:tcPr>
+            <w:tcW w:type="dxa" w:w="3038"/>
             <w:tcBorders>
               <w:top w:val="single" w:color="A6A6A6" w:sz="4"/>
               <w:left w:val="single" w:color="A6A6A6" w:sz="4"/>
@@ -4114,7 +4114,7 @@
         </w:tc>
         <w:tc>
           <w:tcPr>
-            <w:tcW w:type="dxa" w:w="1600"/>
+            <w:tcW w:type="dxa" w:w="1500"/>
             <w:tcBorders>
               <w:top w:val="single" w:color="A6A6A6" w:sz="4"/>
               <w:left w:val="single" w:color="A6A6A6" w:sz="4"/>
@@ -4173,103 +4173,103 @@
                 <w:sz w:val="18"/>
                 <w:szCs w:val="18"/>
               </w:rPr>
-              <w:t xml:space="preserve">Contenedor de 1.000 l de scrap</w:t>
-            </w:r>
-          </w:p>
-        </w:tc>
-        <w:tc>
-          <w:tcPr>
-            <w:tcW w:type="dxa" w:w="2600"/>
-            <w:tcBorders>
-              <w:top w:val="single" w:color="A6A6A6" w:sz="4"/>
-              <w:left w:val="single" w:color="A6A6A6" w:sz="4"/>
-              <w:bottom w:val="single" w:color="A6A6A6" w:sz="4"/>
-              <w:right w:val="single" w:color="A6A6A6" w:sz="4"/>
-            </w:tcBorders>
-            <w:tcMar>
-              <w:top w:type="dxa" w:w="40"/>
-              <w:left w:type="dxa" w:w="80"/>
-              <w:bottom w:type="dxa" w:w="40"/>
-              <w:right w:type="dxa" w:w="80"/>
-            </w:tcMar>
-          </w:tcPr>
-          <w:p>
-            <w:pPr>
-              <w:spacing w:after="0"/>
-            </w:pPr>
-            <w:r>
-              <w:rPr>
-                <w:rFonts w:ascii="Arial" w:cs="Arial" w:eastAsia="Arial" w:hAnsi="Arial"/>
-                <w:sz w:val="18"/>
-                <w:szCs w:val="18"/>
-              </w:rPr>
-              <w:t xml:space="preserve">Afuera, en la fila este del almacén</w:t>
-            </w:r>
-          </w:p>
-        </w:tc>
-        <w:tc>
-          <w:tcPr>
-            <w:tcW w:type="dxa" w:w="4300"/>
-            <w:tcBorders>
-              <w:top w:val="single" w:color="A6A6A6" w:sz="4"/>
-              <w:left w:val="single" w:color="A6A6A6" w:sz="4"/>
-              <w:bottom w:val="single" w:color="A6A6A6" w:sz="4"/>
-              <w:right w:val="single" w:color="A6A6A6" w:sz="4"/>
-            </w:tcBorders>
-            <w:tcMar>
-              <w:top w:type="dxa" w:w="40"/>
-              <w:left w:type="dxa" w:w="80"/>
-              <w:bottom w:type="dxa" w:w="40"/>
-              <w:right w:type="dxa" w:w="80"/>
-            </w:tcMar>
-          </w:tcPr>
-          <w:p>
-            <w:pPr>
-              <w:spacing w:after="0"/>
-            </w:pPr>
-            <w:r>
-              <w:rPr>
-                <w:rFonts w:ascii="Arial" w:cs="Arial" w:eastAsia="Arial" w:hAnsi="Arial"/>
-                <w:sz w:val="18"/>
-                <w:szCs w:val="18"/>
-              </w:rPr>
-              <w:t xml:space="preserve">Sin cambios: los dos carros se vuelcan ahí y el contenedor sale al volquete</w:t>
-            </w:r>
-          </w:p>
-        </w:tc>
-        <w:tc>
-          <w:tcPr>
-            <w:tcW w:type="dxa" w:w="3438"/>
-            <w:tcBorders>
-              <w:top w:val="single" w:color="A6A6A6" w:sz="4"/>
-              <w:left w:val="single" w:color="A6A6A6" w:sz="4"/>
-              <w:bottom w:val="single" w:color="A6A6A6" w:sz="4"/>
-              <w:right w:val="single" w:color="A6A6A6" w:sz="4"/>
-            </w:tcBorders>
-            <w:tcMar>
-              <w:top w:type="dxa" w:w="40"/>
-              <w:left w:type="dxa" w:w="80"/>
-              <w:bottom w:type="dxa" w:w="40"/>
-              <w:right w:type="dxa" w:w="80"/>
-            </w:tcMar>
-          </w:tcPr>
-          <w:p>
-            <w:pPr>
-              <w:spacing w:after="0"/>
-            </w:pPr>
-            <w:r>
-              <w:rPr>
-                <w:rFonts w:ascii="Arial" w:cs="Arial" w:eastAsia="Arial" w:hAnsi="Arial"/>
-                <w:sz w:val="18"/>
-                <w:szCs w:val="18"/>
-              </w:rPr>
-              <w:t xml:space="preserve">Plano rev23</w:t>
-            </w:r>
-          </w:p>
-        </w:tc>
-        <w:tc>
-          <w:tcPr>
-            <w:tcW w:type="dxa" w:w="1600"/>
+              <w:t xml:space="preserve">Contenedor de 1.000 l para el scrap de las dos guillotinas</w:t>
+            </w:r>
+          </w:p>
+        </w:tc>
+        <w:tc>
+          <w:tcPr>
+            <w:tcW w:type="dxa" w:w="3300"/>
+            <w:tcBorders>
+              <w:top w:val="single" w:color="A6A6A6" w:sz="4"/>
+              <w:left w:val="single" w:color="A6A6A6" w:sz="4"/>
+              <w:bottom w:val="single" w:color="A6A6A6" w:sz="4"/>
+              <w:right w:val="single" w:color="A6A6A6" w:sz="4"/>
+            </w:tcBorders>
+            <w:tcMar>
+              <w:top w:type="dxa" w:w="40"/>
+              <w:left w:type="dxa" w:w="80"/>
+              <w:bottom w:type="dxa" w:w="40"/>
+              <w:right w:type="dxa" w:w="80"/>
+            </w:tcMar>
+          </w:tcPr>
+          <w:p>
+            <w:pPr>
+              <w:spacing w:after="0"/>
+            </w:pPr>
+            <w:r>
+              <w:rPr>
+                <w:rFonts w:ascii="Arial" w:cs="Arial" w:eastAsia="Arial" w:hAnsi="Arial"/>
+                <w:sz w:val="18"/>
+                <w:szCs w:val="18"/>
+              </w:rPr>
+              <w:t xml:space="preserve">Los carros se vuelcan ahí; el contenedor sale al volquete</w:t>
+            </w:r>
+          </w:p>
+        </w:tc>
+        <w:tc>
+          <w:tcPr>
+            <w:tcW w:type="dxa" w:w="4100"/>
+            <w:tcBorders>
+              <w:top w:val="single" w:color="A6A6A6" w:sz="4"/>
+              <w:left w:val="single" w:color="A6A6A6" w:sz="4"/>
+              <w:bottom w:val="single" w:color="A6A6A6" w:sz="4"/>
+              <w:right w:val="single" w:color="A6A6A6" w:sz="4"/>
+            </w:tcBorders>
+            <w:tcMar>
+              <w:top w:type="dxa" w:w="40"/>
+              <w:left w:type="dxa" w:w="80"/>
+              <w:bottom w:type="dxa" w:w="40"/>
+              <w:right w:type="dxa" w:w="80"/>
+            </w:tcMar>
+          </w:tcPr>
+          <w:p>
+            <w:pPr>
+              <w:spacing w:after="0"/>
+            </w:pPr>
+            <w:r>
+              <w:rPr>
+                <w:rFonts w:ascii="Arial" w:cs="Arial" w:eastAsia="Arial" w:hAnsi="Arial"/>
+                <w:sz w:val="18"/>
+                <w:szCs w:val="18"/>
+              </w:rPr>
+              <w:t xml:space="preserve">Contenedor de 1.000 l con volcador frontal. Ubicación a definir</w:t>
+            </w:r>
+          </w:p>
+        </w:tc>
+        <w:tc>
+          <w:tcPr>
+            <w:tcW w:type="dxa" w:w="3038"/>
+            <w:tcBorders>
+              <w:top w:val="single" w:color="A6A6A6" w:sz="4"/>
+              <w:left w:val="single" w:color="A6A6A6" w:sz="4"/>
+              <w:bottom w:val="single" w:color="A6A6A6" w:sz="4"/>
+              <w:right w:val="single" w:color="A6A6A6" w:sz="4"/>
+            </w:tcBorders>
+            <w:tcMar>
+              <w:top w:type="dxa" w:w="40"/>
+              <w:left w:type="dxa" w:w="80"/>
+              <w:bottom w:type="dxa" w:w="40"/>
+              <w:right w:type="dxa" w:w="80"/>
+            </w:tcMar>
+          </w:tcPr>
+          <w:p>
+            <w:pPr>
+              <w:spacing w:after="0"/>
+            </w:pPr>
+            <w:r>
+              <w:rPr>
+                <w:rFonts w:ascii="Arial" w:cs="Arial" w:eastAsia="Arial" w:hAnsi="Arial"/>
+                <w:sz w:val="18"/>
+                <w:szCs w:val="18"/>
+              </w:rPr>
+              <w:t xml:space="preserve">Seguridad Global (medida a verificar en el link)</w:t>
+            </w:r>
+          </w:p>
+        </w:tc>
+        <w:tc>
+          <w:tcPr>
+            <w:tcW w:type="dxa" w:w="1500"/>
             <w:tcBorders>
               <w:top w:val="single" w:color="A6A6A6" w:sz="4"/>
               <w:left w:val="single" w:color="A6A6A6" w:sz="4"/>
@@ -4292,11 +4292,11 @@
                 <w:rFonts w:ascii="Arial" w:cs="Arial" w:eastAsia="Arial" w:hAnsi="Arial"/>
                 <w:b/>
                 <w:bCs/>
-                <w:color w:val="375623"/>
-                <w:sz w:val="18"/>
-                <w:szCs w:val="18"/>
-              </w:rPr>
-              <w:t xml:space="preserve">OK</w:t>
+                <w:color w:val="7F6000"/>
+                <w:sz w:val="18"/>
+                <w:szCs w:val="18"/>
+              </w:rPr>
+              <w:t xml:space="preserve">A confirmar</w:t>
             </w:r>
           </w:p>
         </w:tc>
@@ -4343,7 +4343,7 @@
           <w:sz w:val="18"/>
           <w:szCs w:val="18"/>
         </w:rPr>
-        <w:t xml:space="preserve">un carro por guillotina, cada uno del lado del operario. Los dos se vuelcan en el contenedor de 1.000 l del almacén. Cantidad en el pico: ≈70 kg/día de manuales y ≈28 kg/día de carros (Word Manuales y Word Carros).</w:t>
+        <w:t xml:space="preserve">un carro por guillotina, cada uno del lado del operario. Los dos se vuelcan en el contenedor de 1.000 l (ubicación a definir). Cantidad en el pico: ≈70 kg/día de manuales y ≈28 kg/día de carros (Word Manuales y Word Carros).</w:t>
       </w:r>
     </w:p>
     <w:p>
@@ -4371,7 +4371,7 @@
           <w:sz w:val="18"/>
           <w:szCs w:val="18"/>
         </w:rPr>
-        <w:t xml:space="preserve">solo en los cambios de mantenimiento; se guarda en el sector de mantenimiento, como en el plano rev23.</w:t>
+        <w:t xml:space="preserve">solo en los cambios de mantenimiento; se guarda en el sector de mantenimiento.</w:t>
       </w:r>
     </w:p>
     <w:p>
@@ -4433,7 +4433,25 @@
           <w:sz w:val="18"/>
           <w:szCs w:val="18"/>
         </w:rPr>
-        <w:t xml:space="preserve">Con el puente grúa, ¿la mesa elevadora 1 se queda o sale?</w:t>
+        <w:t xml:space="preserve">Con el puente grúa, ¿hay mesa elevadora en la G1 o la grúa lleva la hoja directo?</w:t>
+      </w:r>
+    </w:p>
+    <w:p>
+      <w:pPr>
+        <w:pStyle w:val="ListParagraph"/>
+        <w:numPr>
+          <w:ilvl w:val="0"/>
+          <w:numId w:val="2"/>
+        </w:numPr>
+        <w:spacing w:after="40"/>
+      </w:pPr>
+      <w:r>
+        <w:rPr>
+          <w:rFonts w:ascii="Arial" w:cs="Arial" w:eastAsia="Arial" w:hAnsi="Arial"/>
+          <w:sz w:val="18"/>
+          <w:szCs w:val="18"/>
+        </w:rPr>
+        <w:t xml:space="preserve">Mesa elevadora 2: ¿SJG de 2,6 × 1,8 m o el equivalente de 2,5 × 1,3 m?</w:t>
       </w:r>
     </w:p>
     <w:p>
@@ -4469,7 +4487,7 @@
           <w:sz w:val="18"/>
           <w:szCs w:val="18"/>
         </w:rPr>
-        <w:t xml:space="preserve">Medidas de los brazos de apoyo y recorrido del tope de la QC12Y: pedirlos a los fabricantes.</w:t>
+        <w:t xml:space="preserve">Pedir a los fabricantes: medida de los brazos de apoyo de la HGS y recorrido del tope de la QC12Y.</w:t>
       </w:r>
     </w:p>
     <w:p>
@@ -4487,7 +4505,7 @@
           <w:sz w:val="18"/>
           <w:szCs w:val="18"/>
         </w:rPr>
-        <w:t xml:space="preserve">Medida del carro de cajas de accesorios.</w:t>
+        <w:t xml:space="preserve">Medidas sin fuente: carros de scrap, carro de cajas de accesorios, rampa de salida de la G2 y lugar del operario.</w:t>
       </w:r>
     </w:p>
     <w:p>
@@ -4510,7 +4528,7 @@
       <w:pPr>
         <w:spacing w:after="60"/>
       </w:pPr>
-      <w:hyperlink w:history="1" r:id="rIdsmxrvanciyld0umv_x_3i">
+      <w:hyperlink w:history="1" r:id="rId2lgqpa7gm1svjj5xmxodd">
         <w:r>
           <w:rPr>
             <w:rFonts w:ascii="Arial" w:cs="Arial" w:eastAsia="Arial" w:hAnsi="Arial"/>
@@ -4530,7 +4548,7 @@
         </w:rPr>
         <w:t xml:space="preserve"> · </w:t>
       </w:r>
-      <w:hyperlink w:history="1" r:id="rIdygx8i_vapcf4spbwiyrkd">
+      <w:hyperlink w:history="1" r:id="rIdcqdtg2q_qwwz87iscgxrq">
         <w:r>
           <w:rPr>
             <w:rFonts w:ascii="Arial" w:cs="Arial" w:eastAsia="Arial" w:hAnsi="Arial"/>
@@ -4550,7 +4568,7 @@
         </w:rPr>
         <w:t xml:space="preserve"> · </w:t>
       </w:r>
-      <w:hyperlink w:history="1" r:id="rIdf48gq1kzq2hgdxf7ah3is">
+      <w:hyperlink w:history="1" r:id="rIdbuozzngxcsleylpudwq2c">
         <w:r>
           <w:rPr>
             <w:rFonts w:ascii="Arial" w:cs="Arial" w:eastAsia="Arial" w:hAnsi="Arial"/>
@@ -4570,7 +4588,7 @@
         </w:rPr>
         <w:t xml:space="preserve"> · </w:t>
       </w:r>
-      <w:hyperlink w:history="1" r:id="rIdw8khzdymbryxhjcd2wjof">
+      <w:hyperlink w:history="1" r:id="rIdjjyo6ewawphfwenlt7bc_">
         <w:r>
           <w:rPr>
             <w:rFonts w:ascii="Arial" w:cs="Arial" w:eastAsia="Arial" w:hAnsi="Arial"/>
@@ -4590,7 +4608,7 @@
         </w:rPr>
         <w:t xml:space="preserve"> · </w:t>
       </w:r>
-      <w:hyperlink w:history="1" r:id="rIdf7vb9630sins_ygy5fjh9">
+      <w:hyperlink w:history="1" r:id="rIdfkxmdzzhhl-tr52wckipk">
         <w:r>
           <w:rPr>
             <w:rFonts w:ascii="Arial" w:cs="Arial" w:eastAsia="Arial" w:hAnsi="Arial"/>
@@ -4610,7 +4628,7 @@
         </w:rPr>
         <w:t xml:space="preserve"> · </w:t>
       </w:r>
-      <w:hyperlink w:history="1" r:id="rIdz_cy_muzuu4sowmel-ksz">
+      <w:hyperlink w:history="1" r:id="rIdlbrkjp5hftktei-nr_s9c">
         <w:r>
           <w:rPr>
             <w:rFonts w:ascii="Arial" w:cs="Arial" w:eastAsia="Arial" w:hAnsi="Arial"/>
@@ -4630,7 +4648,7 @@
         </w:rPr>
         <w:t xml:space="preserve"> · </w:t>
       </w:r>
-      <w:hyperlink w:history="1" r:id="rIdf923xkuxtcilmbavcacsj">
+      <w:hyperlink w:history="1" r:id="rId3ldtz2kyrs5xwr2hobp1r">
         <w:r>
           <w:rPr>
             <w:rFonts w:ascii="Arial" w:cs="Arial" w:eastAsia="Arial" w:hAnsi="Arial"/>
@@ -4650,7 +4668,7 @@
         </w:rPr>
         <w:t xml:space="preserve"> · </w:t>
       </w:r>
-      <w:hyperlink w:history="1" r:id="rIdm8toa4cnrioqljrdsinz9">
+      <w:hyperlink w:history="1" r:id="rIdbryobwszdfsuhlevvbou2">
         <w:r>
           <w:rPr>
             <w:rFonts w:ascii="Arial" w:cs="Arial" w:eastAsia="Arial" w:hAnsi="Arial"/>
@@ -4670,7 +4688,7 @@
         </w:rPr>
         <w:t xml:space="preserve"> · </w:t>
       </w:r>
-      <w:hyperlink w:history="1" r:id="rIdsqswf0uu4kis4zftpidpj">
+      <w:hyperlink w:history="1" r:id="rId3ygqexu3wduar3-9z8ln7">
         <w:r>
           <w:rPr>
             <w:rFonts w:ascii="Arial" w:cs="Arial" w:eastAsia="Arial" w:hAnsi="Arial"/>
@@ -4690,7 +4708,7 @@
         </w:rPr>
         <w:t xml:space="preserve"> · </w:t>
       </w:r>
-      <w:hyperlink w:history="1" r:id="rIdtqbr2odta8khh8uzcyu18">
+      <w:hyperlink w:history="1" r:id="rId0vgkvsjyt8zbsg04wx61x">
         <w:r>
           <w:rPr>
             <w:rFonts w:ascii="Arial" w:cs="Arial" w:eastAsia="Arial" w:hAnsi="Arial"/>
@@ -4710,7 +4728,7 @@
         </w:rPr>
         <w:t xml:space="preserve"> · </w:t>
       </w:r>
-      <w:hyperlink w:history="1" r:id="rIdp8uspjddphq5ozwj-ekgs">
+      <w:hyperlink w:history="1" r:id="rIdc0n6kcc039npogz2vsu2h">
         <w:r>
           <w:rPr>
             <w:rFonts w:ascii="Arial" w:cs="Arial" w:eastAsia="Arial" w:hAnsi="Arial"/>
@@ -4730,7 +4748,7 @@
         </w:rPr>
         <w:t xml:space="preserve"> · </w:t>
       </w:r>
-      <w:hyperlink w:history="1" r:id="rId_9qrpi1eznwruejbsq5ow">
+      <w:hyperlink w:history="1" r:id="rIdk_rzjkajxitcf6mrwkaqu">
         <w:r>
           <w:rPr>
             <w:rFonts w:ascii="Arial" w:cs="Arial" w:eastAsia="Arial" w:hAnsi="Arial"/>
@@ -4750,7 +4768,7 @@
         </w:rPr>
         <w:t xml:space="preserve"> · </w:t>
       </w:r>
-      <w:hyperlink w:history="1" r:id="rIdp6tllylw6dsbkzdp0hcp1">
+      <w:hyperlink w:history="1" r:id="rIdaprsddjd7jsjrqj0ljmhd">
         <w:r>
           <w:rPr>
             <w:rFonts w:ascii="Arial" w:cs="Arial" w:eastAsia="Arial" w:hAnsi="Arial"/>
@@ -4760,6 +4778,66 @@
             <w:u w:val="single"/>
           </w:rPr>
           <w:t xml:space="preserve">Ventosa Hamilton VH3</w:t>
+        </w:r>
+      </w:hyperlink>
+      <w:r>
+        <w:rPr>
+          <w:rFonts w:ascii="Arial" w:cs="Arial" w:eastAsia="Arial" w:hAnsi="Arial"/>
+          <w:sz w:val="18"/>
+          <w:szCs w:val="18"/>
+        </w:rPr>
+        <w:t xml:space="preserve"> · </w:t>
+      </w:r>
+      <w:hyperlink w:history="1" r:id="rIdpqydvfkwxtsgoiooawbun">
+        <w:r>
+          <w:rPr>
+            <w:rFonts w:ascii="Arial" w:cs="Arial" w:eastAsia="Arial" w:hAnsi="Arial"/>
+            <w:color w:val="0563C1"/>
+            <w:sz w:val="18"/>
+            <w:szCs w:val="18"/>
+            <w:u w:val="single"/>
+          </w:rPr>
+          <w:t xml:space="preserve">Contenedor 1.000 l (Seguridad Global)</w:t>
+        </w:r>
+      </w:hyperlink>
+      <w:r>
+        <w:rPr>
+          <w:rFonts w:ascii="Arial" w:cs="Arial" w:eastAsia="Arial" w:hAnsi="Arial"/>
+          <w:sz w:val="18"/>
+          <w:szCs w:val="18"/>
+        </w:rPr>
+        <w:t xml:space="preserve"> · </w:t>
+      </w:r>
+      <w:hyperlink w:history="1" r:id="rId9f741ltdpot8rxmzoqemr">
+        <w:r>
+          <w:rPr>
+            <w:rFonts w:ascii="Arial" w:cs="Arial" w:eastAsia="Arial" w:hAnsi="Arial"/>
+            <w:color w:val="0563C1"/>
+            <w:sz w:val="18"/>
+            <w:szCs w:val="18"/>
+            <w:u w:val="single"/>
+          </w:rPr>
+          <w:t xml:space="preserve">Carro FCEP10520 (Storage Compat)</w:t>
+        </w:r>
+      </w:hyperlink>
+      <w:r>
+        <w:rPr>
+          <w:rFonts w:ascii="Arial" w:cs="Arial" w:eastAsia="Arial" w:hAnsi="Arial"/>
+          <w:sz w:val="18"/>
+          <w:szCs w:val="18"/>
+        </w:rPr>
+        <w:t xml:space="preserve"> · </w:t>
+      </w:r>
+      <w:hyperlink w:history="1" r:id="rIddryjxg25kbirbdeewgvi2">
+        <w:r>
+          <w:rPr>
+            <w:rFonts w:ascii="Arial" w:cs="Arial" w:eastAsia="Arial" w:hAnsi="Arial"/>
+            <w:color w:val="0563C1"/>
+            <w:sz w:val="18"/>
+            <w:szCs w:val="18"/>
+            <w:u w:val="single"/>
+          </w:rPr>
+          <w:t xml:space="preserve">Mesa SJG3.0-1.6 (fabricante)</w:t>
         </w:r>
       </w:hyperlink>
     </w:p>
@@ -4775,7 +4853,7 @@
           <w:sz w:val="18"/>
           <w:szCs w:val="18"/>
         </w:rPr>
-        <w:t xml:space="preserve">Documentos internos: Balanceo-FLAMA2035.xlsx y PULMONES-FLAMA2035.xlsx (Fran), Word de proceso CARROS y MANUALES, plano rev23.</w:t>
+        <w:t xml:space="preserve">Documentos internos: Balanceo-FLAMA2035.xlsx y PULMONES-FLAMA2035.xlsx (Fran). Los Word de proceso CARROS y MANUALES se usan solo para la lógica del proceso, no para medidas.</w:t>
       </w:r>
     </w:p>
     <w:sectPr>

</xml_diff>

<commit_message>
Propuesta del puesto de corte: mesa 1 SJG3.0-1.6 y mesa 2 de 1.500 kg (2,5 × 1,3 m)
Co-Authored-By: Claude Opus 5.5 <noreply@anthropic.com>
Claude-Session: https://claude.ai/code/session_01E33CYXtZ2f33D1RjoRdR65
</commit_message>
<xml_diff>
--- a/dimensiones/propuesta_puesto_corte.docx
+++ b/dimensiones/propuesta_puesto_corte.docx
@@ -1319,7 +1319,7 @@
                 <w:sz w:val="18"/>
                 <w:szCs w:val="18"/>
               </w:rPr>
-              <w:t xml:space="preserve">Ingreso de la chapa</w:t>
+              <w:t xml:space="preserve">Mesa elevadora 1 (paquete de hojas)</w:t>
             </w:r>
           </w:p>
         </w:tc>
@@ -1349,7 +1349,7 @@
                 <w:sz w:val="18"/>
                 <w:szCs w:val="18"/>
               </w:rPr>
-              <w:t xml:space="preserve">Llevar la hoja a la altura de la mesa de la guillotina</w:t>
+              <w:t xml:space="preserve">El puente grúa deja el paquete; la mesa sube la hoja de arriba a la altura de los brazos de apoyo</w:t>
             </w:r>
           </w:p>
         </w:tc>
@@ -1379,7 +1379,7 @@
                 <w:sz w:val="18"/>
                 <w:szCs w:val="18"/>
               </w:rPr>
-              <w:t xml:space="preserve">Puente grúa (definido por el grupo). Falta decidir si deja el paquete en una mesa elevadora o lleva la hoja directo a la G1</w:t>
+              <w:t xml:space="preserve">SJG3.0-1.6: 2,6 × 1,8 m, 3 t. Paquete más pesado: 1.342 kg (tanda de 10 kg, 19 hojas). La hoja de 1,5 × 3,0 m sobresale 0,2 m por punta</w:t>
             </w:r>
           </w:p>
         </w:tc>
@@ -1409,7 +1409,7 @@
                 <w:sz w:val="18"/>
                 <w:szCs w:val="18"/>
               </w:rPr>
-              <w:t xml:space="preserve">Decisión del grupo</w:t>
+              <w:t xml:space="preserve">Fabricante SJG (medidas a verificar en el link) · Balanceo › Lotes fila 11 · Alternativas corte › Corte</w:t>
             </w:r>
           </w:p>
         </w:tc>
@@ -1438,11 +1438,11 @@
                 <w:rFonts w:ascii="Arial" w:cs="Arial" w:eastAsia="Arial" w:hAnsi="Arial"/>
                 <w:b/>
                 <w:bCs/>
-                <w:color w:val="1F4E79"/>
-                <w:sz w:val="18"/>
-                <w:szCs w:val="18"/>
-              </w:rPr>
-              <w:t xml:space="preserve">Discutir</w:t>
+                <w:color w:val="375623"/>
+                <w:sz w:val="18"/>
+                <w:szCs w:val="18"/>
+              </w:rPr>
+              <w:t xml:space="preserve">OK</w:t>
             </w:r>
           </w:p>
         </w:tc>
@@ -3273,7 +3273,7 @@
                 <w:sz w:val="18"/>
                 <w:szCs w:val="18"/>
               </w:rPr>
-              <w:t xml:space="preserve">Pulmón entre la G1 y la G2</w:t>
+              <w:t xml:space="preserve">Pulmón de 2 hojas de franjas entre la G1 y la G2; la G2 apoya las franjas una al lado de la otra</w:t>
             </w:r>
           </w:p>
         </w:tc>
@@ -3303,7 +3303,7 @@
                 <w:sz w:val="18"/>
                 <w:szCs w:val="18"/>
               </w:rPr>
-              <w:t xml:space="preserve">Elegir una: SJG3.0-1.6 de 2,6 × 1,8 m (fabricante) o el equivalente de 2,5 × 1,3 m que hoy figura en la planilla</w:t>
+              <w:t xml:space="preserve">Workplace Products de 1.500 kg (SKU 10320015): 2,5 × 1,3 m, cerrada 300 mm, máxima 1.950 mm. Carga máxima: 336 kg (2 hojas de 4,75 mm). La franja de 1,5 m sobresale 0,2 m hacia la G2</w:t>
             </w:r>
           </w:p>
         </w:tc>
@@ -3333,7 +3333,7 @@
                 <w:sz w:val="18"/>
                 <w:szCs w:val="18"/>
               </w:rPr>
-              <w:t xml:space="preserve">Pulmones I6 · fabricante SJG · Workplace Products</w:t>
+              <w:t xml:space="preserve">Workplace Products · Balanceo › Parametros A38 · Alternativas corte › Corte</w:t>
             </w:r>
           </w:p>
         </w:tc>
@@ -3362,11 +3362,11 @@
                 <w:rFonts w:ascii="Arial" w:cs="Arial" w:eastAsia="Arial" w:hAnsi="Arial"/>
                 <w:b/>
                 <w:bCs/>
-                <w:color w:val="1F4E79"/>
-                <w:sz w:val="18"/>
-                <w:szCs w:val="18"/>
-              </w:rPr>
-              <w:t xml:space="preserve">Discutir</w:t>
+                <w:color w:val="375623"/>
+                <w:sz w:val="18"/>
+                <w:szCs w:val="18"/>
+              </w:rPr>
+              <w:t xml:space="preserve">OK</w:t>
             </w:r>
           </w:p>
         </w:tc>
@@ -4433,42 +4433,6 @@
           <w:sz w:val="18"/>
           <w:szCs w:val="18"/>
         </w:rPr>
-        <w:t xml:space="preserve">Con el puente grúa, ¿hay mesa elevadora en la G1 o la grúa lleva la hoja directo?</w:t>
-      </w:r>
-    </w:p>
-    <w:p>
-      <w:pPr>
-        <w:pStyle w:val="ListParagraph"/>
-        <w:numPr>
-          <w:ilvl w:val="0"/>
-          <w:numId w:val="2"/>
-        </w:numPr>
-        <w:spacing w:after="40"/>
-      </w:pPr>
-      <w:r>
-        <w:rPr>
-          <w:rFonts w:ascii="Arial" w:cs="Arial" w:eastAsia="Arial" w:hAnsi="Arial"/>
-          <w:sz w:val="18"/>
-          <w:szCs w:val="18"/>
-        </w:rPr>
-        <w:t xml:space="preserve">Mesa elevadora 2: ¿SJG de 2,6 × 1,8 m o el equivalente de 2,5 × 1,3 m?</w:t>
-      </w:r>
-    </w:p>
-    <w:p>
-      <w:pPr>
-        <w:pStyle w:val="ListParagraph"/>
-        <w:numPr>
-          <w:ilvl w:val="0"/>
-          <w:numId w:val="2"/>
-        </w:numPr>
-        <w:spacing w:after="40"/>
-      </w:pPr>
-      <w:r>
-        <w:rPr>
-          <w:rFonts w:ascii="Arial" w:cs="Arial" w:eastAsia="Arial" w:hAnsi="Arial"/>
-          <w:sz w:val="18"/>
-          <w:szCs w:val="18"/>
-        </w:rPr>
         <w:t xml:space="preserve">Carros FCEP: ¿1 o 2, y con la medida del carro (1,065 × 0,70 m) o la de Fran (1,3 × 0,7 m, con maniobra)?</w:t>
       </w:r>
     </w:p>
@@ -4528,7 +4492,7 @@
       <w:pPr>
         <w:spacing w:after="60"/>
       </w:pPr>
-      <w:hyperlink w:history="1" r:id="rId2lgqpa7gm1svjj5xmxodd">
+      <w:hyperlink w:history="1" r:id="rId_dv2wlpj6o9_vmvldzbub">
         <w:r>
           <w:rPr>
             <w:rFonts w:ascii="Arial" w:cs="Arial" w:eastAsia="Arial" w:hAnsi="Arial"/>
@@ -4548,7 +4512,7 @@
         </w:rPr>
         <w:t xml:space="preserve"> · </w:t>
       </w:r>
-      <w:hyperlink w:history="1" r:id="rIdcqdtg2q_qwwz87iscgxrq">
+      <w:hyperlink w:history="1" r:id="rIddzoofs5bzzb-timsrexdu">
         <w:r>
           <w:rPr>
             <w:rFonts w:ascii="Arial" w:cs="Arial" w:eastAsia="Arial" w:hAnsi="Arial"/>
@@ -4568,7 +4532,7 @@
         </w:rPr>
         <w:t xml:space="preserve"> · </w:t>
       </w:r>
-      <w:hyperlink w:history="1" r:id="rIdbuozzngxcsleylpudwq2c">
+      <w:hyperlink w:history="1" r:id="rIdncusu0naw29xzfrdm8anp">
         <w:r>
           <w:rPr>
             <w:rFonts w:ascii="Arial" w:cs="Arial" w:eastAsia="Arial" w:hAnsi="Arial"/>
@@ -4588,7 +4552,7 @@
         </w:rPr>
         <w:t xml:space="preserve"> · </w:t>
       </w:r>
-      <w:hyperlink w:history="1" r:id="rIdjjyo6ewawphfwenlt7bc_">
+      <w:hyperlink w:history="1" r:id="rIdtoili-ul_mitvnjtwqdna">
         <w:r>
           <w:rPr>
             <w:rFonts w:ascii="Arial" w:cs="Arial" w:eastAsia="Arial" w:hAnsi="Arial"/>
@@ -4608,7 +4572,7 @@
         </w:rPr>
         <w:t xml:space="preserve"> · </w:t>
       </w:r>
-      <w:hyperlink w:history="1" r:id="rIdfkxmdzzhhl-tr52wckipk">
+      <w:hyperlink w:history="1" r:id="rIdwvty6dqlgbuouizy3lzbx">
         <w:r>
           <w:rPr>
             <w:rFonts w:ascii="Arial" w:cs="Arial" w:eastAsia="Arial" w:hAnsi="Arial"/>
@@ -4628,7 +4592,7 @@
         </w:rPr>
         <w:t xml:space="preserve"> · </w:t>
       </w:r>
-      <w:hyperlink w:history="1" r:id="rIdlbrkjp5hftktei-nr_s9c">
+      <w:hyperlink w:history="1" r:id="rId8folbwiwj3jap4lfnq2cf">
         <w:r>
           <w:rPr>
             <w:rFonts w:ascii="Arial" w:cs="Arial" w:eastAsia="Arial" w:hAnsi="Arial"/>
@@ -4648,7 +4612,7 @@
         </w:rPr>
         <w:t xml:space="preserve"> · </w:t>
       </w:r>
-      <w:hyperlink w:history="1" r:id="rId3ldtz2kyrs5xwr2hobp1r">
+      <w:hyperlink w:history="1" r:id="rIdgmt8o5eq9h4g2rsxlqdpa">
         <w:r>
           <w:rPr>
             <w:rFonts w:ascii="Arial" w:cs="Arial" w:eastAsia="Arial" w:hAnsi="Arial"/>
@@ -4668,7 +4632,7 @@
         </w:rPr>
         <w:t xml:space="preserve"> · </w:t>
       </w:r>
-      <w:hyperlink w:history="1" r:id="rIdbryobwszdfsuhlevvbou2">
+      <w:hyperlink w:history="1" r:id="rIdcjgmbiybndrxuemnnxj_c">
         <w:r>
           <w:rPr>
             <w:rFonts w:ascii="Arial" w:cs="Arial" w:eastAsia="Arial" w:hAnsi="Arial"/>
@@ -4688,7 +4652,7 @@
         </w:rPr>
         <w:t xml:space="preserve"> · </w:t>
       </w:r>
-      <w:hyperlink w:history="1" r:id="rId3ygqexu3wduar3-9z8ln7">
+      <w:hyperlink w:history="1" r:id="rId1npfuswfgs7g7xabnltpt">
         <w:r>
           <w:rPr>
             <w:rFonts w:ascii="Arial" w:cs="Arial" w:eastAsia="Arial" w:hAnsi="Arial"/>
@@ -4708,7 +4672,7 @@
         </w:rPr>
         <w:t xml:space="preserve"> · </w:t>
       </w:r>
-      <w:hyperlink w:history="1" r:id="rId0vgkvsjyt8zbsg04wx61x">
+      <w:hyperlink w:history="1" r:id="rIdw_sw4fur0nkiomnl4xvyc">
         <w:r>
           <w:rPr>
             <w:rFonts w:ascii="Arial" w:cs="Arial" w:eastAsia="Arial" w:hAnsi="Arial"/>
@@ -4728,7 +4692,7 @@
         </w:rPr>
         <w:t xml:space="preserve"> · </w:t>
       </w:r>
-      <w:hyperlink w:history="1" r:id="rIdc0n6kcc039npogz2vsu2h">
+      <w:hyperlink w:history="1" r:id="rIdvjk7tp7ihbu6ewuvle3md">
         <w:r>
           <w:rPr>
             <w:rFonts w:ascii="Arial" w:cs="Arial" w:eastAsia="Arial" w:hAnsi="Arial"/>
@@ -4748,7 +4712,7 @@
         </w:rPr>
         <w:t xml:space="preserve"> · </w:t>
       </w:r>
-      <w:hyperlink w:history="1" r:id="rIdk_rzjkajxitcf6mrwkaqu">
+      <w:hyperlink w:history="1" r:id="rIdz4xqljbmm9uidwlaowrvo">
         <w:r>
           <w:rPr>
             <w:rFonts w:ascii="Arial" w:cs="Arial" w:eastAsia="Arial" w:hAnsi="Arial"/>
@@ -4768,7 +4732,7 @@
         </w:rPr>
         <w:t xml:space="preserve"> · </w:t>
       </w:r>
-      <w:hyperlink w:history="1" r:id="rIdaprsddjd7jsjrqj0ljmhd">
+      <w:hyperlink w:history="1" r:id="rIdx-pomu5tpfwgawx-drdbz">
         <w:r>
           <w:rPr>
             <w:rFonts w:ascii="Arial" w:cs="Arial" w:eastAsia="Arial" w:hAnsi="Arial"/>
@@ -4788,7 +4752,7 @@
         </w:rPr>
         <w:t xml:space="preserve"> · </w:t>
       </w:r>
-      <w:hyperlink w:history="1" r:id="rIdpqydvfkwxtsgoiooawbun">
+      <w:hyperlink w:history="1" r:id="rIdo3ljrenehrtvstflijbmk">
         <w:r>
           <w:rPr>
             <w:rFonts w:ascii="Arial" w:cs="Arial" w:eastAsia="Arial" w:hAnsi="Arial"/>
@@ -4808,7 +4772,7 @@
         </w:rPr>
         <w:t xml:space="preserve"> · </w:t>
       </w:r>
-      <w:hyperlink w:history="1" r:id="rId9f741ltdpot8rxmzoqemr">
+      <w:hyperlink w:history="1" r:id="rId1zlvtolz1amikivunpqrv">
         <w:r>
           <w:rPr>
             <w:rFonts w:ascii="Arial" w:cs="Arial" w:eastAsia="Arial" w:hAnsi="Arial"/>
@@ -4828,7 +4792,7 @@
         </w:rPr>
         <w:t xml:space="preserve"> · </w:t>
       </w:r>
-      <w:hyperlink w:history="1" r:id="rIddryjxg25kbirbdeewgvi2">
+      <w:hyperlink w:history="1" r:id="rIdiynwoe643l8-fxurewwym">
         <w:r>
           <w:rPr>
             <w:rFonts w:ascii="Arial" w:cs="Arial" w:eastAsia="Arial" w:hAnsi="Arial"/>
@@ -4838,6 +4802,46 @@
             <w:u w:val="single"/>
           </w:rPr>
           <w:t xml:space="preserve">Mesa SJG3.0-1.6 (fabricante)</w:t>
+        </w:r>
+      </w:hyperlink>
+      <w:r>
+        <w:rPr>
+          <w:rFonts w:ascii="Arial" w:cs="Arial" w:eastAsia="Arial" w:hAnsi="Arial"/>
+          <w:sz w:val="18"/>
+          <w:szCs w:val="18"/>
+        </w:rPr>
+        <w:t xml:space="preserve"> · </w:t>
+      </w:r>
+      <w:hyperlink w:history="1" r:id="rIdncp-fdueek1tflg1cmof8">
+        <w:r>
+          <w:rPr>
+            <w:rFonts w:ascii="Arial" w:cs="Arial" w:eastAsia="Arial" w:hAnsi="Arial"/>
+            <w:color w:val="0563C1"/>
+            <w:sz w:val="18"/>
+            <w:szCs w:val="18"/>
+            <w:u w:val="single"/>
+          </w:rPr>
+          <w:t xml:space="preserve">Mesa de 1.500 kg (Workplace Products)</w:t>
+        </w:r>
+      </w:hyperlink>
+      <w:r>
+        <w:rPr>
+          <w:rFonts w:ascii="Arial" w:cs="Arial" w:eastAsia="Arial" w:hAnsi="Arial"/>
+          <w:sz w:val="18"/>
+          <w:szCs w:val="18"/>
+        </w:rPr>
+        <w:t xml:space="preserve"> · </w:t>
+      </w:r>
+      <w:hyperlink w:history="1" r:id="rIdmevufvofjqdwzowtgsrrf">
+        <w:r>
+          <w:rPr>
+            <w:rFonts w:ascii="Arial" w:cs="Arial" w:eastAsia="Arial" w:hAnsi="Arial"/>
+            <w:color w:val="0563C1"/>
+            <w:sz w:val="18"/>
+            <w:szCs w:val="18"/>
+            <w:u w:val="single"/>
+          </w:rPr>
+          <w:t xml:space="preserve">Alternativas corte</w:t>
         </w:r>
       </w:hyperlink>
     </w:p>

</xml_diff>